<commit_message>
Checkpoint 4.1: drop "next build step" line (Word edit, synced to Markdown)
Co-Authored-By: Claude Opus 5.5 <noreply@anthropic.com>
</commit_message>
<xml_diff>
--- a/docs/Capstone Checkpoint 4.1 - Tree-of-Thought Reasoning.docx
+++ b/docs/Capstone Checkpoint 4.1 - Tree-of-Thought Reasoning.docx
@@ -10,13 +10,12 @@
       <w:r>
         <w:rPr>
           <w:rFonts w:ascii="Open Sans" w:hAnsi="Open Sans" w:cs="Open Sans"/>
-          <w:b/>
           <w:bCs/>
           <w:color w:val="A6192E"/>
           <w:sz w:val="34"/>
           <w:szCs w:val="34"/>
         </w:rPr>
-        <w:t xml:space="preserve">Capstone Checkpoint 4.1: Tree-of-Thought Reasoning</w:t>
+        <w:t>Capstone Checkpoint 4.1: Tree-of-Thought Reasoning</w:t>
       </w:r>
     </w:p>
     <w:p>
@@ -27,13 +26,12 @@
       <w:r>
         <w:rPr>
           <w:rFonts w:ascii="Open Sans" w:hAnsi="Open Sans" w:cs="Open Sans"/>
-          <w:b/>
           <w:bCs/>
           <w:color w:val="A6192E"/>
           <w:sz w:val="26"/>
           <w:szCs w:val="26"/>
         </w:rPr>
-        <w:t xml:space="preserve">Thesis Check: Choosing the Right Claims Before Testing Them</w:t>
+        <w:t>Thesis Check: Choosing the Right Claims Before Testing Them</w:t>
       </w:r>
     </w:p>
     <w:p>
@@ -49,7 +47,7 @@
           <w:sz w:val="21"/>
           <w:szCs w:val="21"/>
         </w:rPr>
-        <w:t xml:space="preserve">Mohit Sachdeva  |  Agentic AI Program  |  October 2026</w:t>
+        <w:t>Mohit Sachdeva  |  Agentic AI Program  |  October 2026</w:t>
       </w:r>
     </w:p>
     <w:p>
@@ -63,13 +61,12 @@
       <w:r>
         <w:rPr>
           <w:rFonts w:ascii="Open Sans" w:hAnsi="Open Sans" w:cs="Open Sans"/>
-          <w:b/>
           <w:bCs/>
           <w:color w:val="A6192E"/>
           <w:sz w:val="25"/>
           <w:szCs w:val="25"/>
         </w:rPr>
-        <w:t xml:space="preserve">1. Is Tree-of-Thought appropriate?</w:t>
+        <w:t>1. Is Tree-of-Thought appropriate?</w:t>
       </w:r>
     </w:p>
     <w:p>
@@ -84,7 +81,7 @@
           <w:sz w:val="21"/>
           <w:szCs w:val="21"/>
         </w:rPr>
-        <w:t xml:space="preserve">Yes, in one place. Tree-of-Thought (ToT) improves the step where the Thesis Analyst turns a thesis into claims, and it would hurt everywhere else in Thesis Check.</w:t>
+        <w:t>Yes, in one place. Tree-of-Thought (ToT) improves the step where the Thesis Analyst turns a thesis into claims, and it would hurt everywhere else in Thesis Check.</w:t>
       </w:r>
     </w:p>
     <w:p>
@@ -99,7 +96,7 @@
           <w:sz w:val="21"/>
           <w:szCs w:val="21"/>
         </w:rPr>
-        <w:t xml:space="preserve">Checkpoint 2.1 added a reasoning loop only where the next step depends on what was just observed. ToT gets a matching rule: explore alternatives only where (1) an early wrong choice is expensive, (2) no later step can catch it, and (3) candidates can be scored cheaply before committing to one. Claim decomposition is the only step that meets all three.</w:t>
+        <w:t>Checkpoint 2.1 added a reasoning loop only where the next step depends on what was just observed. ToT gets a matching rule: explore alternatives only where (1) an early wrong choice is expensive, (2) no later step can catch it, and (3) candidates can be scored cheaply before committing to one. Claim decomposition is the only step that meets all three.</w:t>
       </w:r>
     </w:p>
     <w:tbl>
@@ -145,13 +142,12 @@
             <w:r>
               <w:rPr>
                 <w:rFonts w:ascii="Open Sans" w:hAnsi="Open Sans" w:cs="Open Sans"/>
-                <w:b/>
                 <w:bCs/>
                 <w:color w:val="FFFFFF"/>
                 <w:sz w:val="18"/>
                 <w:szCs w:val="18"/>
               </w:rPr>
-              <w:t xml:space="preserve">Step</w:t>
+              <w:t>Step</w:t>
             </w:r>
           </w:p>
         </w:tc>
@@ -167,13 +163,12 @@
             <w:r>
               <w:rPr>
                 <w:rFonts w:ascii="Open Sans" w:hAnsi="Open Sans" w:cs="Open Sans"/>
-                <w:b/>
                 <w:bCs/>
                 <w:color w:val="FFFFFF"/>
                 <w:sz w:val="18"/>
                 <w:szCs w:val="18"/>
               </w:rPr>
-              <w:t xml:space="preserve">Reasoning today (2.1)</w:t>
+              <w:t>Reasoning today (2.1)</w:t>
             </w:r>
           </w:p>
         </w:tc>
@@ -189,13 +184,12 @@
             <w:r>
               <w:rPr>
                 <w:rFonts w:ascii="Open Sans" w:hAnsi="Open Sans" w:cs="Open Sans"/>
-                <w:b/>
                 <w:bCs/>
                 <w:color w:val="FFFFFF"/>
                 <w:sz w:val="18"/>
                 <w:szCs w:val="18"/>
               </w:rPr>
-              <w:t xml:space="preserve">ToT?</w:t>
+              <w:t>ToT?</w:t>
             </w:r>
           </w:p>
         </w:tc>
@@ -211,13 +205,12 @@
             <w:r>
               <w:rPr>
                 <w:rFonts w:ascii="Open Sans" w:hAnsi="Open Sans" w:cs="Open Sans"/>
-                <w:b/>
                 <w:bCs/>
                 <w:color w:val="FFFFFF"/>
                 <w:sz w:val="18"/>
                 <w:szCs w:val="18"/>
               </w:rPr>
-              <w:t xml:space="preserve">Why</w:t>
+              <w:t>Why</w:t>
             </w:r>
           </w:p>
         </w:tc>
@@ -242,7 +235,7 @@
                 <w:sz w:val="18"/>
                 <w:szCs w:val="18"/>
               </w:rPr>
-              <w:t xml:space="preserve">Thesis Analyst: claim decomposition</w:t>
+              <w:t>Thesis Analyst: claim decomposition</w:t>
             </w:r>
           </w:p>
         </w:tc>
@@ -262,7 +255,7 @@
                 <w:sz w:val="18"/>
                 <w:szCs w:val="18"/>
               </w:rPr>
-              <w:t xml:space="preserve">One structured step, plus clarifying questions</w:t>
+              <w:t>One structured step, plus clarifying questions</w:t>
             </w:r>
           </w:p>
         </w:tc>
@@ -277,13 +270,12 @@
             <w:r>
               <w:rPr>
                 <w:rFonts w:ascii="Open Sans" w:hAnsi="Open Sans" w:cs="Open Sans"/>
-                <w:b/>
                 <w:bCs/>
                 <w:color w:val="000000"/>
                 <w:sz w:val="18"/>
                 <w:szCs w:val="18"/>
               </w:rPr>
-              <w:t xml:space="preserve">Yes</w:t>
+              <w:t>Yes</w:t>
             </w:r>
           </w:p>
         </w:tc>
@@ -303,7 +295,7 @@
                 <w:sz w:val="18"/>
                 <w:szCs w:val="18"/>
               </w:rPr>
-              <w:t xml:space="preserve">Every later step inherits the claims, no loop sends them back, and testability can be checked cheaply before research starts</w:t>
+              <w:t>Every later step inherits the claims, no loop sends them back, and testability can be checked cheaply before research starts</w:t>
             </w:r>
           </w:p>
         </w:tc>
@@ -329,7 +321,7 @@
                 <w:sz w:val="18"/>
                 <w:szCs w:val="18"/>
               </w:rPr>
-              <w:t xml:space="preserve">Filing Researcher</w:t>
+              <w:t>Filing Researcher</w:t>
             </w:r>
           </w:p>
         </w:tc>
@@ -350,7 +342,7 @@
                 <w:sz w:val="18"/>
                 <w:szCs w:val="18"/>
               </w:rPr>
-              <w:t xml:space="preserve">ReAct loop</w:t>
+              <w:t>ReAct loop</w:t>
             </w:r>
           </w:p>
         </w:tc>
@@ -371,7 +363,7 @@
                 <w:sz w:val="18"/>
                 <w:szCs w:val="18"/>
               </w:rPr>
-              <w:t xml:space="preserve">No</w:t>
+              <w:t>No</w:t>
             </w:r>
           </w:p>
         </w:tc>
@@ -392,7 +384,7 @@
                 <w:sz w:val="18"/>
                 <w:szCs w:val="18"/>
               </w:rPr>
-              <w:t xml:space="preserve">Each search result shows what to try next. A miss stays local to one claim and ends as “insufficient evidence.” Branching would multiply retrieval calls without adding evidence</w:t>
+              <w:t>Each search result shows what to try next. A miss stays local to one claim and ends as “insufficient evidence.” Branching would multiply retrieval calls without adding evidence</w:t>
             </w:r>
           </w:p>
         </w:tc>
@@ -417,7 +409,7 @@
                 <w:sz w:val="18"/>
                 <w:szCs w:val="18"/>
               </w:rPr>
-              <w:t xml:space="preserve">Financial Data Analyst</w:t>
+              <w:t>Financial Data Analyst</w:t>
             </w:r>
           </w:p>
         </w:tc>
@@ -437,7 +429,7 @@
                 <w:sz w:val="18"/>
                 <w:szCs w:val="18"/>
               </w:rPr>
-              <w:t xml:space="preserve">Short ReAct loop</w:t>
+              <w:t>Short ReAct loop</w:t>
             </w:r>
           </w:p>
         </w:tc>
@@ -457,7 +449,7 @@
                 <w:sz w:val="18"/>
                 <w:szCs w:val="18"/>
               </w:rPr>
-              <w:t xml:space="preserve">No</w:t>
+              <w:t>No</w:t>
             </w:r>
           </w:p>
         </w:tc>
@@ -477,7 +469,7 @@
                 <w:sz w:val="18"/>
                 <w:szCs w:val="18"/>
               </w:rPr>
-              <w:t xml:space="preserve">Few alternatives (e.g., gross profit = revenue − cost of revenue), and tools do the arithmetic</w:t>
+              <w:t>Few alternatives (e.g., gross profit = revenue − cost of revenue), and tools do the arithmetic</w:t>
             </w:r>
           </w:p>
         </w:tc>
@@ -503,7 +495,7 @@
                 <w:sz w:val="18"/>
                 <w:szCs w:val="18"/>
               </w:rPr>
-              <w:t xml:space="preserve">Bull and Bear Advocates</w:t>
+              <w:t>Bull and Bear Advocates</w:t>
             </w:r>
           </w:p>
         </w:tc>
@@ -524,7 +516,7 @@
                 <w:sz w:val="18"/>
                 <w:szCs w:val="18"/>
               </w:rPr>
-              <w:t xml:space="preserve">One-round structured debate</w:t>
+              <w:t>One-round structured debate</w:t>
             </w:r>
           </w:p>
         </w:tc>
@@ -545,7 +537,7 @@
                 <w:sz w:val="18"/>
                 <w:szCs w:val="18"/>
               </w:rPr>
-              <w:t xml:space="preserve">No</w:t>
+              <w:t>No</w:t>
             </w:r>
           </w:p>
         </w:tc>
@@ -566,7 +558,7 @@
                 <w:sz w:val="18"/>
                 <w:szCs w:val="18"/>
               </w:rPr>
-              <w:t xml:space="preserve">They argue only from gathered evidence. Searching for the most persuasive argument rewards rhetoric, not truth</w:t>
+              <w:t>They argue only from gathered evidence. Searching for the most persuasive argument rewards rhetoric, not truth</w:t>
             </w:r>
           </w:p>
         </w:tc>
@@ -591,7 +583,7 @@
                 <w:sz w:val="18"/>
                 <w:szCs w:val="18"/>
               </w:rPr>
-              <w:t xml:space="preserve">Fact-Checker</w:t>
+              <w:t>Fact-Checker</w:t>
             </w:r>
           </w:p>
         </w:tc>
@@ -611,7 +603,7 @@
                 <w:sz w:val="18"/>
                 <w:szCs w:val="18"/>
               </w:rPr>
-              <w:t xml:space="preserve">Rule-based checks</w:t>
+              <w:t>Rule-based checks</w:t>
             </w:r>
           </w:p>
         </w:tc>
@@ -631,7 +623,7 @@
                 <w:sz w:val="18"/>
                 <w:szCs w:val="18"/>
               </w:rPr>
-              <w:t xml:space="preserve">No</w:t>
+              <w:t>No</w:t>
             </w:r>
           </w:p>
         </w:tc>
@@ -651,7 +643,7 @@
                 <w:sz w:val="18"/>
                 <w:szCs w:val="18"/>
               </w:rPr>
-              <w:t xml:space="preserve">A number matches its source or it doesn’t. There is one right answer</w:t>
+              <w:t>A number matches its source or it doesn’t. There is one right answer</w:t>
             </w:r>
           </w:p>
         </w:tc>
@@ -677,7 +669,7 @@
                 <w:sz w:val="18"/>
                 <w:szCs w:val="18"/>
               </w:rPr>
-              <w:t xml:space="preserve">Supervisor and verdict rubric</w:t>
+              <w:t>Supervisor and verdict rubric</w:t>
             </w:r>
           </w:p>
         </w:tc>
@@ -698,7 +690,7 @@
                 <w:sz w:val="18"/>
                 <w:szCs w:val="18"/>
               </w:rPr>
-              <w:t xml:space="preserve">Fixed workflow and rules</w:t>
+              <w:t>Fixed workflow and rules</w:t>
             </w:r>
           </w:p>
         </w:tc>
@@ -719,7 +711,7 @@
                 <w:sz w:val="18"/>
                 <w:szCs w:val="18"/>
               </w:rPr>
-              <w:t xml:space="preserve">No, by design</w:t>
+              <w:t>No, by design</w:t>
             </w:r>
           </w:p>
         </w:tc>
@@ -740,7 +732,7 @@
                 <w:sz w:val="18"/>
                 <w:szCs w:val="18"/>
               </w:rPr>
-              <w:t xml:space="preserve">The same filing must give the same verdict, and cost must stay bounded. A search over verdicts breaks both</w:t>
+              <w:t>The same filing must give the same verdict, and cost must stay bounded. A search over verdicts breaks both</w:t>
             </w:r>
           </w:p>
         </w:tc>
@@ -762,13 +754,12 @@
       <w:r>
         <w:rPr>
           <w:rFonts w:ascii="Open Sans" w:hAnsi="Open Sans" w:cs="Open Sans"/>
-          <w:b/>
           <w:bCs/>
           <w:color w:val="A6192E"/>
           <w:sz w:val="25"/>
           <w:szCs w:val="25"/>
         </w:rPr>
-        <w:t xml:space="preserve">2. Where ToT is used</w:t>
+        <w:t>2. Where ToT is used</w:t>
       </w:r>
     </w:p>
     <w:p>
@@ -783,7 +774,7 @@
           <w:sz w:val="21"/>
           <w:szCs w:val="21"/>
         </w:rPr>
-        <w:t xml:space="preserve">ToT runs inside the Thesis Analyst, after the investor enters a thesis and before they confirm the claims. Its job is to pick the best set of 3–5 testable claims. It runs once per thesis: quarterly re-checks reload the confirmed claims from long-term memory, so they never pay for the search again and stay comparable over time.</w:t>
+        <w:t>ToT runs inside the Thesis Analyst, after the investor enters a thesis and before they confirm the claims. Its job is to pick the best set of 3–5 testable claims. It runs once per thesis: quarterly re-checks reload the confirmed claims from long-term memory, so they never pay for the search again and stay comparable over time.</w:t>
       </w:r>
     </w:p>
     <w:p>
@@ -798,7 +789,7 @@
           <w:sz w:val="21"/>
           <w:szCs w:val="21"/>
         </w:rPr>
-        <w:t xml:space="preserve">Take Priya’s thesis, “AI demand will keep gross margins above 60%.” A linear chain of thought fails here in three ways.</w:t>
+        <w:t>Take Priya’s thesis, “AI demand will keep gross margins above 60%.” A linear chain of thought fails here in three ways.</w:t>
       </w:r>
     </w:p>
     <w:p>
@@ -812,13 +803,13 @@
       <w:r>
         <w:rPr>
           <w:rFonts w:ascii="Open Sans" w:hAnsi="Open Sans" w:cs="Open Sans"/>
-          <w:b/>
           <w:bCs/>
           <w:color w:val="000000"/>
           <w:sz w:val="21"/>
           <w:szCs w:val="21"/>
         </w:rPr>
-        <w:t xml:space="preserve">Premature commitment.</w:t>
+        <w:lastRenderedPageBreak/>
+        <w:t>Premature commitment.</w:t>
       </w:r>
       <w:r>
         <w:rPr>
@@ -842,13 +833,12 @@
       <w:r>
         <w:rPr>
           <w:rFonts w:ascii="Open Sans" w:hAnsi="Open Sans" w:cs="Open Sans"/>
-          <w:b/>
           <w:bCs/>
           <w:color w:val="000000"/>
           <w:sz w:val="21"/>
           <w:szCs w:val="21"/>
         </w:rPr>
-        <w:t xml:space="preserve">High branching.</w:t>
+        <w:t>High branching.</w:t>
       </w:r>
       <w:r>
         <w:rPr>
@@ -872,13 +862,12 @@
       <w:r>
         <w:rPr>
           <w:rFonts w:ascii="Open Sans" w:hAnsi="Open Sans" w:cs="Open Sans"/>
-          <w:b/>
           <w:bCs/>
           <w:color w:val="000000"/>
           <w:sz w:val="21"/>
           <w:szCs w:val="21"/>
         </w:rPr>
-        <w:t xml:space="preserve">Constraint complexity.</w:t>
+        <w:t>Constraint complexity.</w:t>
       </w:r>
       <w:r>
         <w:rPr>
@@ -900,7 +889,7 @@
           <w:sz w:val="21"/>
           <w:szCs w:val="21"/>
         </w:rPr>
-        <w:t xml:space="preserve">this company’s</w:t>
+        <w:t>this company’s</w:t>
       </w:r>
       <w:r>
         <w:rPr>
@@ -921,13 +910,10 @@
       <w:r>
         <w:rPr>
           <w:rFonts w:ascii="Open Sans" w:hAnsi="Open Sans" w:cs="Open Sans"/>
-          <w:b/>
           <w:bCs/>
           <w:color w:val="A6192E"/>
-          <w:sz w:val="22"/>
-          <w:szCs w:val="22"/>
-        </w:rPr>
-        <w:t xml:space="preserve">Where ToT sits in the workflow</w:t>
+        </w:rPr>
+        <w:t>Where ToT sits in the workflow</w:t>
       </w:r>
     </w:p>
     <w:p>
@@ -942,7 +928,7 @@
           <w:sz w:val="21"/>
           <w:szCs w:val="21"/>
         </w:rPr>
-        <w:t xml:space="preserve">Figure 1 updates the Checkpoint 2.1 system design. ToT is added inside the Thesis Analyst, between the clarifying questions and the investor’s claim confirmation. Every other agent, loop and checkpoint is unchanged.</w:t>
+        <w:t>Figure 1 updates the Checkpoint 2.1 system design. ToT is added inside the Thesis Analyst, between the clarifying questions and the investor’s claim confirmation. Every other agent, loop and checkpoint is unchanged.</w:t>
       </w:r>
     </w:p>
     <w:p>
@@ -955,6 +941,7 @@
         <w:rPr>
           <w:noProof/>
         </w:rPr>
+        <w:lastRenderedPageBreak/>
         <w:drawing>
           <wp:inline distT="0" distB="0" distL="0" distR="0">
             <wp:extent cx="6126480" cy="5483200"/>
@@ -971,7 +958,7 @@
                     <pic:cNvPicPr/>
                   </pic:nvPicPr>
                   <pic:blipFill>
-                    <a:blip r:embed="rId200"/>
+                    <a:blip r:embed="rId12"/>
                     <a:stretch>
                       <a:fillRect/>
                     </a:stretch>
@@ -1007,7 +994,7 @@
           <w:sz w:val="17"/>
           <w:szCs w:val="17"/>
         </w:rPr>
-        <w:t xml:space="preserve">Figure 1. Thesis Check system design, updated for Checkpoint 4.1.</w:t>
+        <w:t>Figure 1. Thesis Check system design, updated for Checkpoint 4.1.</w:t>
       </w:r>
     </w:p>
     <w:p>
@@ -1022,7 +1009,7 @@
           <w:sz w:val="21"/>
           <w:szCs w:val="21"/>
         </w:rPr>
-        <w:t xml:space="preserve">The run order, with the ToT step expanded:</w:t>
+        <w:t>The run order, with the ToT step expanded:</w:t>
       </w:r>
     </w:p>
     <w:tbl>
@@ -1067,7 +1054,8 @@
                 <w:sz w:val="15"/>
                 <w:szCs w:val="15"/>
               </w:rPr>
-              <w:t xml:space="preserve">Investor: ticker + thesis         (new ticker → filings ingested, so the probes can run)</w:t>
+              <w:lastRenderedPageBreak/>
+              <w:t>Investor: ticker + thesis         (new ticker → filings ingested, so the probes can run)</w:t>
             </w:r>
           </w:p>
           <w:p>
@@ -1112,7 +1100,7 @@
                 <w:sz w:val="15"/>
                 <w:szCs w:val="15"/>
               </w:rPr>
-              <w:t xml:space="preserve">Supervisor: fixed workflow, step and cost limits</w:t>
+              <w:t>Supervisor: fixed workflow, step and cost limits</w:t>
             </w:r>
           </w:p>
           <w:p>
@@ -1157,7 +1145,7 @@
                 <w:sz w:val="15"/>
                 <w:szCs w:val="15"/>
               </w:rPr>
-              <w:t xml:space="preserve">Thesis Analyst</w:t>
+              <w:t>Thesis Analyst</w:t>
             </w:r>
           </w:p>
           <w:p>
@@ -1277,7 +1265,7 @@
                 <w:sz w:val="15"/>
                 <w:szCs w:val="15"/>
               </w:rPr>
-              <w:t xml:space="preserve">HUMAN CHECKPOINT: investor confirms, edits (edits re-gated) or picks one of two readings</w:t>
+              <w:t>HUMAN CHECKPOINT: investor confirms, edits (edits re-gated) or picks one of two readings</w:t>
             </w:r>
           </w:p>
           <w:p>
@@ -1322,7 +1310,7 @@
                 <w:sz w:val="15"/>
                 <w:szCs w:val="15"/>
               </w:rPr>
-              <w:t xml:space="preserve">Filing Researcher (ReAct)  ||  Financial Data Analyst (ReAct)    same MCP tools as the probes</w:t>
+              <w:t>Filing Researcher (ReAct)  ||  Financial Data Analyst (ReAct)    same MCP tools as the probes</w:t>
             </w:r>
           </w:p>
           <w:p>
@@ -1367,7 +1355,7 @@
                 <w:sz w:val="15"/>
                 <w:szCs w:val="15"/>
               </w:rPr>
-              <w:t xml:space="preserve">Bull ↔ Bear debate  →  Fact-Checker ────┘</w:t>
+              <w:t>Bull ↔ Bear debate  →  Fact-Checker ────┘</w:t>
             </w:r>
           </w:p>
           <w:p>
@@ -1412,7 +1400,7 @@
                 <w:sz w:val="15"/>
                 <w:szCs w:val="15"/>
               </w:rPr>
-              <w:t xml:space="preserve">Verdict rubric (code) → Report Writer</w:t>
+              <w:t>Verdict rubric (code) → Report Writer</w:t>
             </w:r>
           </w:p>
           <w:p>
@@ -1457,7 +1445,7 @@
                 <w:sz w:val="15"/>
                 <w:szCs w:val="15"/>
               </w:rPr>
-              <w:t xml:space="preserve">HUMAN CHECKPOINT: approve or override → long-term memory (claims, verdict, decision)</w:t>
+              <w:t>HUMAN CHECKPOINT: approve or override → long-term memory (claims, verdict, decision)</w:t>
             </w:r>
           </w:p>
         </w:tc>
@@ -1480,7 +1468,7 @@
           <w:sz w:val="21"/>
           <w:szCs w:val="21"/>
         </w:rPr>
-        <w:t xml:space="preserve">The workflow makes two points visible. The Fact-Checker’s rework loop returns to the evidence agents, never to the claim search, so claim errors have to be caught before confirmation. And quarterly re-checks start from the confirmed claims, so they skip ToT entirely.</w:t>
+        <w:t>The workflow makes two points visible. The Fact-Checker’s rework loop returns to the evidence agents, never to the claim search, so claim errors have to be caught before confirmation. And quarterly re-checks start from the confirmed claims, so they skip ToT entirely.</w:t>
       </w:r>
     </w:p>
     <w:p>
@@ -1494,13 +1482,12 @@
       <w:r>
         <w:rPr>
           <w:rFonts w:ascii="Open Sans" w:hAnsi="Open Sans" w:cs="Open Sans"/>
-          <w:b/>
           <w:bCs/>
           <w:color w:val="A6192E"/>
           <w:sz w:val="25"/>
           <w:szCs w:val="25"/>
         </w:rPr>
-        <w:t xml:space="preserve">3. ToT structure</w:t>
+        <w:t>3. ToT structure</w:t>
       </w:r>
     </w:p>
     <w:tbl>
@@ -1544,13 +1531,12 @@
             <w:r>
               <w:rPr>
                 <w:rFonts w:ascii="Open Sans" w:hAnsi="Open Sans" w:cs="Open Sans"/>
-                <w:b/>
                 <w:bCs/>
                 <w:color w:val="FFFFFF"/>
                 <w:sz w:val="18"/>
                 <w:szCs w:val="18"/>
               </w:rPr>
-              <w:t xml:space="preserve">Element</w:t>
+              <w:t>Element</w:t>
             </w:r>
           </w:p>
         </w:tc>
@@ -1566,13 +1552,12 @@
             <w:r>
               <w:rPr>
                 <w:rFonts w:ascii="Open Sans" w:hAnsi="Open Sans" w:cs="Open Sans"/>
-                <w:b/>
                 <w:bCs/>
                 <w:color w:val="FFFFFF"/>
                 <w:sz w:val="18"/>
                 <w:szCs w:val="18"/>
               </w:rPr>
-              <w:t xml:space="preserve">In Thesis Check</w:t>
+              <w:t>In Thesis Check</w:t>
             </w:r>
           </w:p>
         </w:tc>
@@ -1597,7 +1582,7 @@
                 <w:sz w:val="18"/>
                 <w:szCs w:val="18"/>
               </w:rPr>
-              <w:t xml:space="preserve">Thought</w:t>
+              <w:t>Thought</w:t>
             </w:r>
           </w:p>
         </w:tc>
@@ -1617,7 +1602,7 @@
                 <w:sz w:val="18"/>
                 <w:szCs w:val="18"/>
               </w:rPr>
-              <w:t xml:space="preserve">One decision about how to make the thesis testable: how to read it, or how to measure it</w:t>
+              <w:t>One decision about how to make the thesis testable: how to read it, or how to measure it</w:t>
             </w:r>
           </w:p>
         </w:tc>
@@ -1643,7 +1628,7 @@
                 <w:sz w:val="18"/>
                 <w:szCs w:val="18"/>
               </w:rPr>
-              <w:t xml:space="preserve">Node (reasoning state)</w:t>
+              <w:t>Node (reasoning state)</w:t>
             </w:r>
           </w:p>
         </w:tc>
@@ -1664,7 +1649,7 @@
                 <w:sz w:val="18"/>
                 <w:szCs w:val="18"/>
               </w:rPr>
-              <w:t xml:space="preserve">Everything decided so far: the root plus the thoughts on the path to it. A depth-1 state holds the thesis and one reading; a depth-2 state adds one claim set. States are stored as immutable records (Section 6)</w:t>
+              <w:t>Everything decided so far: the root plus the thoughts on the path to it. A depth-1 state holds the thesis and one reading; a depth-2 state adds one claim set. States are stored as immutable records (Section 6)</w:t>
             </w:r>
           </w:p>
         </w:tc>
@@ -1689,7 +1674,7 @@
                 <w:sz w:val="18"/>
                 <w:szCs w:val="18"/>
               </w:rPr>
-              <w:t xml:space="preserve">Root (depth 0)</w:t>
+              <w:t>Root (depth 0)</w:t>
             </w:r>
           </w:p>
         </w:tc>
@@ -1709,7 +1694,7 @@
                 <w:sz w:val="18"/>
                 <w:szCs w:val="18"/>
               </w:rPr>
-              <w:t xml:space="preserve">The thesis as written, the ticker, any clarifying answers, and the thresholds the investor stated (extracted by code)</w:t>
+              <w:t>The thesis as written, the ticker, any clarifying answers, and the thresholds the investor stated (extracted by code)</w:t>
             </w:r>
           </w:p>
         </w:tc>
@@ -1735,7 +1720,7 @@
                 <w:sz w:val="18"/>
                 <w:szCs w:val="18"/>
               </w:rPr>
-              <w:t xml:space="preserve">Depth 1 node</w:t>
+              <w:t>Depth 1 node</w:t>
             </w:r>
           </w:p>
         </w:tc>
@@ -1761,23 +1746,22 @@
             <w:r>
               <w:rPr>
                 <w:rFonts w:ascii="Open Sans" w:hAnsi="Open Sans" w:cs="Open Sans"/>
-                <w:b/>
                 <w:bCs/>
                 <w:color w:val="000000"/>
                 <w:sz w:val="18"/>
                 <w:szCs w:val="18"/>
               </w:rPr>
-              <w:t xml:space="preserve">reading</w:t>
-            </w:r>
-            <w:r>
-              <w:rPr>
-                <w:rFonts w:ascii="Open Sans" w:hAnsi="Open Sans" w:cs="Open Sans"/>
-                <w:b w:val="0"/>
-                <w:color w:val="000000"/>
-                <w:sz w:val="18"/>
-                <w:szCs w:val="18"/>
-              </w:rPr>
-              <w:t xml:space="preserve">: the thesis as a short cause-and-effect chain with vague words pinned down, e.g., “AI demand → data-center sales grow faster → richer product mix → gross margin ≥ 60% each quarter”</w:t>
+              <w:t>reading</w:t>
+            </w:r>
+            <w:r>
+              <w:rPr>
+                <w:rFonts w:ascii="Open Sans" w:hAnsi="Open Sans" w:cs="Open Sans"/>
+                <w:b w:val="0"/>
+                <w:color w:val="000000"/>
+                <w:sz w:val="18"/>
+                <w:szCs w:val="18"/>
+              </w:rPr>
+              <w:t>: the thesis as a short cause-and-effect chain with vague words pinned down, e.g., “AI demand → data-center sales grow faster → richer product mix → gross margin ≥ 60% each quarter”</w:t>
             </w:r>
           </w:p>
         </w:tc>
@@ -1802,7 +1786,7 @@
                 <w:sz w:val="18"/>
                 <w:szCs w:val="18"/>
               </w:rPr>
-              <w:t xml:space="preserve">Depth 2 node (leaf)</w:t>
+              <w:t>Depth 2 node (leaf)</w:t>
             </w:r>
           </w:p>
         </w:tc>
@@ -1827,23 +1811,22 @@
             <w:r>
               <w:rPr>
                 <w:rFonts w:ascii="Open Sans" w:hAnsi="Open Sans" w:cs="Open Sans"/>
-                <w:b/>
                 <w:bCs/>
                 <w:color w:val="000000"/>
                 <w:sz w:val="18"/>
                 <w:szCs w:val="18"/>
               </w:rPr>
-              <w:t xml:space="preserve">claim set</w:t>
-            </w:r>
-            <w:r>
-              <w:rPr>
-                <w:rFonts w:ascii="Open Sans" w:hAnsi="Open Sans" w:cs="Open Sans"/>
-                <w:b w:val="0"/>
-                <w:color w:val="000000"/>
-                <w:sz w:val="18"/>
-                <w:szCs w:val="18"/>
-              </w:rPr>
-              <w:t xml:space="preserve">: 3–5 claims that measure one reading, each with a metric, comparison, threshold, period and evidence source (XBRL concept or filing section)</w:t>
+              <w:t>claim set</w:t>
+            </w:r>
+            <w:r>
+              <w:rPr>
+                <w:rFonts w:ascii="Open Sans" w:hAnsi="Open Sans" w:cs="Open Sans"/>
+                <w:b w:val="0"/>
+                <w:color w:val="000000"/>
+                <w:sz w:val="18"/>
+                <w:szCs w:val="18"/>
+              </w:rPr>
+              <w:t>: 3–5 claims that measure one reading, each with a metric, comparison, threshold, period and evidence source (XBRL concept or filing section)</w:t>
             </w:r>
           </w:p>
         </w:tc>
@@ -1869,7 +1852,7 @@
                 <w:sz w:val="18"/>
                 <w:szCs w:val="18"/>
               </w:rPr>
-              <w:t xml:space="preserve">Branch</w:t>
+              <w:t>Branch</w:t>
             </w:r>
           </w:p>
         </w:tc>
@@ -1890,7 +1873,7 @@
                 <w:sz w:val="18"/>
                 <w:szCs w:val="18"/>
               </w:rPr>
-              <w:t xml:space="preserve">An alternative thought from the same parent: another reading, or another claim set for the same reading</w:t>
+              <w:t>An alternative thought from the same parent: another reading, or another claim set for the same reading</w:t>
             </w:r>
           </w:p>
         </w:tc>
@@ -1915,7 +1898,7 @@
                 <w:sz w:val="18"/>
                 <w:szCs w:val="18"/>
               </w:rPr>
-              <w:t xml:space="preserve">Branching behavior</w:t>
+              <w:t>Branching behavior</w:t>
             </w:r>
           </w:p>
         </w:tc>
@@ -1935,7 +1918,7 @@
                 <w:sz w:val="18"/>
                 <w:szCs w:val="18"/>
               </w:rPr>
-              <w:t xml:space="preserve">The generator proposes 3 children per node: 3 readings at depth 1, then 3 claim sets for each reading kept. Effective branching is lower: the beam keeps 2 readings, and gates remove claims or whole sets</w:t>
+              <w:t>The generator proposes 3 children per node: 3 readings at depth 1, then 3 claim sets for each reading kept. Effective branching is lower: the beam keeps 2 readings, and gates remove claims or whole sets</w:t>
             </w:r>
           </w:p>
         </w:tc>
@@ -1961,7 +1944,7 @@
                 <w:sz w:val="18"/>
                 <w:szCs w:val="18"/>
               </w:rPr>
-              <w:t xml:space="preserve">Depth limit</w:t>
+              <w:t>Depth limit</w:t>
             </w:r>
           </w:p>
         </w:tc>
@@ -1982,7 +1965,7 @@
                 <w:sz w:val="18"/>
                 <w:szCs w:val="18"/>
               </w:rPr>
-              <w:t xml:space="preserve">2. A leaf is a complete claim set, so nothing is left to decide</w:t>
+              <w:t>2. A leaf is a complete claim set, so nothing is left to decide</w:t>
             </w:r>
           </w:p>
         </w:tc>
@@ -2007,7 +1990,8 @@
                 <w:sz w:val="18"/>
                 <w:szCs w:val="18"/>
               </w:rPr>
-              <w:t xml:space="preserve">Tree size</w:t>
+              <w:lastRenderedPageBreak/>
+              <w:t>Tree size</w:t>
             </w:r>
           </w:p>
         </w:tc>
@@ -2027,7 +2011,7 @@
                 <w:sz w:val="18"/>
                 <w:szCs w:val="18"/>
               </w:rPr>
-              <w:t xml:space="preserve">With a beam width of 2, at most 3 + 6 = 9 nodes are generated and scored</w:t>
+              <w:t>With a beam width of 2, at most 3 + 6 = 9 nodes are generated and scored</w:t>
             </w:r>
           </w:p>
         </w:tc>
@@ -2080,7 +2064,7 @@
                 <w:sz w:val="15"/>
                 <w:szCs w:val="15"/>
               </w:rPr>
-              <w:t xml:space="preserve">Thesis: "AI demand will keep gross margins above 60%"</w:t>
+              <w:t>Thesis: "AI demand will keep gross margins above 60%"</w:t>
             </w:r>
           </w:p>
           <w:p>
@@ -2095,7 +2079,7 @@
                 <w:sz w:val="15"/>
                 <w:szCs w:val="15"/>
               </w:rPr>
-              <w:t xml:space="preserve">├── R1 Pricing power: demand lets the company hold prices → GM ≥ 60%      kept (4.4)</w:t>
+              <w:t>├── R1 Pricing power: demand lets the company hold prices → GM ≥ 60%      kept (4.4)</w:t>
             </w:r>
           </w:p>
           <w:p>
@@ -2110,7 +2094,7 @@
                 <w:sz w:val="15"/>
                 <w:szCs w:val="15"/>
               </w:rPr>
-              <w:t xml:space="preserve">│   └── S1a, S1b, S1c                                                     best: S1a (4.2)</w:t>
+              <w:t>│   └── S1a, S1b, S1c                                                     best: S1a (4.2)</w:t>
             </w:r>
           </w:p>
           <w:p>
@@ -2125,7 +2109,7 @@
                 <w:sz w:val="15"/>
                 <w:szCs w:val="15"/>
               </w:rPr>
-              <w:t xml:space="preserve">├── R2 Mix shift: data-center sales grow faster → richer mix → GM ≥ 60%   kept (4.6)</w:t>
+              <w:t>├── R2 Mix shift: data-center sales grow faster → richer mix → GM ≥ 60%   kept (4.6)</w:t>
             </w:r>
           </w:p>
           <w:p>
@@ -2140,7 +2124,7 @@
                 <w:sz w:val="15"/>
                 <w:szCs w:val="15"/>
               </w:rPr>
-              <w:t xml:space="preserve">│   ├── S2a                                                               SELECTED (4.55)</w:t>
+              <w:t>│   ├── S2a                                                               SELECTED (4.55)</w:t>
             </w:r>
           </w:p>
           <w:p>
@@ -2155,7 +2139,7 @@
                 <w:sz w:val="15"/>
                 <w:szCs w:val="15"/>
               </w:rPr>
-              <w:t xml:space="preserve">│   ├── S2b  AI chip revenue not reported → claim dropped, driver lost    pruned (3.25)</w:t>
+              <w:t>│   ├── S2b  AI chip revenue not reported → claim dropped, driver lost    pruned (3.25)</w:t>
             </w:r>
           </w:p>
           <w:p>
@@ -2170,7 +2154,7 @@
                 <w:sz w:val="15"/>
                 <w:szCs w:val="15"/>
               </w:rPr>
-              <w:t xml:space="preserve">│   └── S2c  stock-price claim dropped by gate                            kept, ranked lower (4.0)</w:t>
+              <w:t>│   └── S2c  stock-price claim dropped by gate                            kept, ranked lower (4.0)</w:t>
             </w:r>
           </w:p>
           <w:p>
@@ -2185,7 +2169,7 @@
                 <w:sz w:val="15"/>
                 <w:szCs w:val="15"/>
               </w:rPr>
-              <w:t xml:space="preserve">└── R3 Guidance only: management guides GM ≥ 60%                          pruned: ranked 3rd (3.0)</w:t>
+              <w:t>└── R3 Guidance only: management guides GM ≥ 60%                          pruned: ranked 3rd (3.0)</w:t>
             </w:r>
           </w:p>
         </w:tc>
@@ -2203,13 +2187,12 @@
       <w:r>
         <w:rPr>
           <w:rFonts w:ascii="Open Sans" w:hAnsi="Open Sans" w:cs="Open Sans"/>
-          <w:b/>
           <w:bCs/>
           <w:color w:val="000000"/>
           <w:sz w:val="21"/>
           <w:szCs w:val="21"/>
         </w:rPr>
-        <w:t xml:space="preserve">Termination and selection.</w:t>
+        <w:t>Termination and selection.</w:t>
       </w:r>
       <w:r>
         <w:rPr>
@@ -2229,13 +2212,12 @@
       <w:r>
         <w:rPr>
           <w:rFonts w:ascii="Open Sans" w:hAnsi="Open Sans" w:cs="Open Sans"/>
-          <w:b/>
           <w:bCs/>
           <w:color w:val="000000"/>
           <w:sz w:val="21"/>
           <w:szCs w:val="21"/>
         </w:rPr>
-        <w:t xml:space="preserve">Why two levels instead of “generate several claim sets and pick the best.”</w:t>
+        <w:t>Why two levels instead of “generate several claim sets and pick the best.”</w:t>
       </w:r>
       <w:r>
         <w:rPr>
@@ -2259,13 +2241,12 @@
       <w:r>
         <w:rPr>
           <w:rFonts w:ascii="Open Sans" w:hAnsi="Open Sans" w:cs="Open Sans"/>
-          <w:b/>
           <w:bCs/>
           <w:color w:val="A6192E"/>
           <w:sz w:val="25"/>
           <w:szCs w:val="25"/>
         </w:rPr>
-        <w:t xml:space="preserve">4. Search and evaluation</w:t>
+        <w:t>4. Search and evaluation</w:t>
       </w:r>
     </w:p>
     <w:p>
@@ -2276,13 +2257,10 @@
       <w:r>
         <w:rPr>
           <w:rFonts w:ascii="Open Sans" w:hAnsi="Open Sans" w:cs="Open Sans"/>
-          <w:b/>
           <w:bCs/>
           <w:color w:val="A6192E"/>
-          <w:sz w:val="22"/>
-          <w:szCs w:val="22"/>
-        </w:rPr>
-        <w:t xml:space="preserve">Search strategy: beam search, width 2</w:t>
+        </w:rPr>
+        <w:t>Search strategy: beam search, width 2</w:t>
       </w:r>
     </w:p>
     <w:tbl>
@@ -2329,13 +2307,12 @@
             <w:r>
               <w:rPr>
                 <w:rFonts w:ascii="Open Sans" w:hAnsi="Open Sans" w:cs="Open Sans"/>
-                <w:b/>
                 <w:bCs/>
                 <w:color w:val="FFFFFF"/>
                 <w:sz w:val="18"/>
                 <w:szCs w:val="18"/>
               </w:rPr>
-              <w:t xml:space="preserve">Strategy</w:t>
+              <w:t>Strategy</w:t>
             </w:r>
           </w:p>
         </w:tc>
@@ -2351,13 +2328,12 @@
             <w:r>
               <w:rPr>
                 <w:rFonts w:ascii="Open Sans" w:hAnsi="Open Sans" w:cs="Open Sans"/>
-                <w:b/>
                 <w:bCs/>
                 <w:color w:val="FFFFFF"/>
                 <w:sz w:val="18"/>
                 <w:szCs w:val="18"/>
               </w:rPr>
-              <w:t xml:space="preserve">Compute</w:t>
+              <w:t>Compute</w:t>
             </w:r>
           </w:p>
         </w:tc>
@@ -2373,13 +2349,12 @@
             <w:r>
               <w:rPr>
                 <w:rFonts w:ascii="Open Sans" w:hAnsi="Open Sans" w:cs="Open Sans"/>
-                <w:b/>
                 <w:bCs/>
                 <w:color w:val="FFFFFF"/>
                 <w:sz w:val="18"/>
                 <w:szCs w:val="18"/>
               </w:rPr>
-              <w:t xml:space="preserve">Latency</w:t>
+              <w:t>Latency</w:t>
             </w:r>
           </w:p>
         </w:tc>
@@ -2395,13 +2370,12 @@
             <w:r>
               <w:rPr>
                 <w:rFonts w:ascii="Open Sans" w:hAnsi="Open Sans" w:cs="Open Sans"/>
-                <w:b/>
                 <w:bCs/>
                 <w:color w:val="FFFFFF"/>
                 <w:sz w:val="18"/>
                 <w:szCs w:val="18"/>
               </w:rPr>
-              <w:t xml:space="preserve">System complexity</w:t>
+              <w:t>System complexity</w:t>
             </w:r>
           </w:p>
         </w:tc>
@@ -2417,13 +2391,12 @@
             <w:r>
               <w:rPr>
                 <w:rFonts w:ascii="Open Sans" w:hAnsi="Open Sans" w:cs="Open Sans"/>
-                <w:b/>
                 <w:bCs/>
                 <w:color w:val="FFFFFF"/>
                 <w:sz w:val="18"/>
                 <w:szCs w:val="18"/>
               </w:rPr>
-              <w:t xml:space="preserve">Fit</w:t>
+              <w:t>Fit</w:t>
             </w:r>
           </w:p>
         </w:tc>
@@ -2443,13 +2416,12 @@
             <w:r>
               <w:rPr>
                 <w:rFonts w:ascii="Open Sans" w:hAnsi="Open Sans" w:cs="Open Sans"/>
-                <w:b/>
                 <w:bCs/>
                 <w:color w:val="000000"/>
                 <w:sz w:val="18"/>
                 <w:szCs w:val="18"/>
               </w:rPr>
-              <w:t xml:space="preserve">Beam search, width 2 (chosen)</w:t>
+              <w:t>Beam search, width 2 (chosen)</w:t>
             </w:r>
           </w:p>
         </w:tc>
@@ -2469,7 +2441,7 @@
                 <w:sz w:val="18"/>
                 <w:szCs w:val="18"/>
               </w:rPr>
-              <w:t xml:space="preserve">Fixed: 9 nodes, 12 LLM calls</w:t>
+              <w:t>Fixed: 9 nodes, 12 LLM calls</w:t>
             </w:r>
           </w:p>
         </w:tc>
@@ -2489,7 +2461,7 @@
                 <w:sz w:val="18"/>
                 <w:szCs w:val="18"/>
               </w:rPr>
-              <w:t xml:space="preserve">4 rounds; calls within a level run in parallel</w:t>
+              <w:t>4 rounds; calls within a level run in parallel</w:t>
             </w:r>
           </w:p>
         </w:tc>
@@ -2509,7 +2481,7 @@
                 <w:sz w:val="18"/>
                 <w:szCs w:val="18"/>
               </w:rPr>
-              <w:t xml:space="preserve">Low: score, sort and keep the top 2 at each level</w:t>
+              <w:t>Low: score, sort and keep the top 2 at each level</w:t>
             </w:r>
           </w:p>
         </w:tc>
@@ -2529,7 +2501,7 @@
                 <w:sz w:val="18"/>
                 <w:szCs w:val="18"/>
               </w:rPr>
-              <w:t xml:space="preserve">Compares readings side by side and drops weak ones before spending calls on them. Width 2 keeps a second reading alive in case the critic misjudges the first</w:t>
+              <w:t>Compares readings side by side and drops weak ones before spending calls on them. Width 2 keeps a second reading alive in case the critic misjudges the first</w:t>
             </w:r>
           </w:p>
         </w:tc>
@@ -2555,7 +2527,7 @@
                 <w:sz w:val="18"/>
                 <w:szCs w:val="18"/>
               </w:rPr>
-              <w:t xml:space="preserve">BFS</w:t>
+              <w:t>BFS</w:t>
             </w:r>
           </w:p>
         </w:tc>
@@ -2576,7 +2548,7 @@
                 <w:sz w:val="18"/>
                 <w:szCs w:val="18"/>
               </w:rPr>
-              <w:t xml:space="preserve">12 nodes, 16 LLM calls, and no cap: 4 readings would mean 20 nodes</w:t>
+              <w:t>12 nodes, 16 LLM calls, and no cap: 4 readings would mean 20 nodes</w:t>
             </w:r>
           </w:p>
         </w:tc>
@@ -2597,7 +2569,7 @@
                 <w:sz w:val="18"/>
                 <w:szCs w:val="18"/>
               </w:rPr>
-              <w:t xml:space="preserve">4 rounds</w:t>
+              <w:t>4 rounds</w:t>
             </w:r>
           </w:p>
         </w:tc>
@@ -2618,7 +2590,7 @@
                 <w:sz w:val="18"/>
                 <w:szCs w:val="18"/>
               </w:rPr>
-              <w:t xml:space="preserve">Lowest: no ranking until the end</w:t>
+              <w:t>Lowest: no ranking until the end</w:t>
             </w:r>
           </w:p>
         </w:tc>
@@ -2639,7 +2611,7 @@
                 <w:sz w:val="18"/>
                 <w:szCs w:val="18"/>
               </w:rPr>
-              <w:t xml:space="preserve">Would work at this size, but it spends calls expanding readings already known to be weak</w:t>
+              <w:t>Would work at this size, but it spends calls expanding readings already known to be weak</w:t>
             </w:r>
           </w:p>
         </w:tc>
@@ -2664,7 +2636,7 @@
                 <w:sz w:val="18"/>
                 <w:szCs w:val="18"/>
               </w:rPr>
-              <w:t xml:space="preserve">DFS</w:t>
+              <w:t>DFS</w:t>
             </w:r>
           </w:p>
         </w:tc>
@@ -2684,7 +2656,7 @@
                 <w:sz w:val="18"/>
                 <w:szCs w:val="18"/>
               </w:rPr>
-              <w:t xml:space="preserve">Unpredictable: as few as 6 calls if the first reading works, up to the BFS count if it backtracks</w:t>
+              <w:t>Unpredictable: as few as 6 calls if the first reading works, up to the BFS count if it backtracks</w:t>
             </w:r>
           </w:p>
         </w:tc>
@@ -2704,7 +2676,7 @@
                 <w:sz w:val="18"/>
                 <w:szCs w:val="18"/>
               </w:rPr>
-              <w:t xml:space="preserve">4 to 8 rounds: readings are tried one after another</w:t>
+              <w:t>4 to 8 rounds: readings are tried one after another</w:t>
             </w:r>
           </w:p>
         </w:tc>
@@ -2724,7 +2696,7 @@
                 <w:sz w:val="18"/>
                 <w:szCs w:val="18"/>
               </w:rPr>
-              <w:t xml:space="preserve">Medium: needs a backtracking stack and a “good enough to stop” rule</w:t>
+              <w:t>Medium: needs a backtracking stack and a “good enough to stop” rule</w:t>
             </w:r>
           </w:p>
         </w:tc>
@@ -2744,7 +2716,7 @@
                 <w:sz w:val="18"/>
                 <w:szCs w:val="18"/>
               </w:rPr>
-              <w:t xml:space="preserve">Commits to the first reading before seeing the others: the premature commitment ToT is meant to fix. The result also depends on generation order</w:t>
+              <w:t>Commits to the first reading before seeing the others: the premature commitment ToT is meant to fix. The result also depends on generation order</w:t>
             </w:r>
           </w:p>
         </w:tc>
@@ -2770,7 +2742,7 @@
                 <w:sz w:val="18"/>
                 <w:szCs w:val="18"/>
               </w:rPr>
-              <w:t xml:space="preserve">Monte Carlo sampling</w:t>
+              <w:t>Monte Carlo sampling</w:t>
             </w:r>
           </w:p>
         </w:tc>
@@ -2791,7 +2763,7 @@
                 <w:sz w:val="18"/>
                 <w:szCs w:val="18"/>
               </w:rPr>
-              <w:t xml:space="preserve">Dozens of rollouts to beat beam on a two-level tree, so it needs its own cap</w:t>
+              <w:t>Dozens of rollouts to beat beam on a two-level tree, so it needs its own cap</w:t>
             </w:r>
           </w:p>
         </w:tc>
@@ -2812,7 +2784,7 @@
                 <w:sz w:val="18"/>
                 <w:szCs w:val="18"/>
               </w:rPr>
-              <w:t xml:space="preserve">Many sequential select-expand-score rounds</w:t>
+              <w:t>Many sequential select-expand-score rounds</w:t>
             </w:r>
           </w:p>
         </w:tc>
@@ -2833,7 +2805,7 @@
                 <w:sz w:val="18"/>
                 <w:szCs w:val="18"/>
               </w:rPr>
-              <w:t xml:space="preserve">High: selection policy, rollouts, score backup and visit counts, all hard to explain in an audit log</w:t>
+              <w:t>High: selection policy, rollouts, score backup and visit counts, all hard to explain in an audit log</w:t>
             </w:r>
           </w:p>
         </w:tc>
@@ -2854,7 +2826,7 @@
                 <w:sz w:val="18"/>
                 <w:szCs w:val="18"/>
               </w:rPr>
-              <w:t xml:space="preserve">Built for deep trees with uncertain payoffs. Here it adds cost and run-to-run variation without improving accuracy</w:t>
+              <w:t>Built for deep trees with uncertain payoffs. Here it adds cost and run-to-run variation without improving accuracy</w:t>
             </w:r>
           </w:p>
         </w:tc>
@@ -2877,7 +2849,8 @@
           <w:sz w:val="21"/>
           <w:szCs w:val="21"/>
         </w:rPr>
-        <w:t xml:space="preserve">The generator proposes all three siblings in one call and is asked to make them differ. It runs at temperature 0, so the variety comes from the prompt, not random sampling, and the same thesis produces nearly the same tree.</w:t>
+        <w:lastRenderedPageBreak/>
+        <w:t>The generator proposes all three siblings in one call and is asked to make them differ. It runs at temperature 0, so the variety comes from the prompt, not random sampling, and the same thesis produces nearly the same tree.</w:t>
       </w:r>
     </w:p>
     <w:p>
@@ -2892,7 +2865,7 @@
           <w:sz w:val="21"/>
           <w:szCs w:val="21"/>
         </w:rPr>
-        <w:t xml:space="preserve">ToT’s complexity stays contained. It is one subgraph inside the Thesis Analyst, with four steps (generate, gate, score, prune) and a linear fallback. Removing it would mean replacing that subgraph with a single call; no other agent would change.</w:t>
+        <w:t>ToT’s complexity stays contained. It is one subgraph inside the Thesis Analyst, with four steps (generate, gate, score, prune) and a linear fallback. Removing it would mean replacing that subgraph with a single call; no other agent would change.</w:t>
       </w:r>
     </w:p>
     <w:p>
@@ -2903,13 +2876,10 @@
       <w:r>
         <w:rPr>
           <w:rFonts w:ascii="Open Sans" w:hAnsi="Open Sans" w:cs="Open Sans"/>
-          <w:b/>
           <w:bCs/>
           <w:color w:val="A6192E"/>
-          <w:sz w:val="22"/>
-          <w:szCs w:val="22"/>
-        </w:rPr>
-        <w:t xml:space="preserve">How branches are assessed</w:t>
+        </w:rPr>
+        <w:t>How branches are assessed</w:t>
       </w:r>
     </w:p>
     <w:p>
@@ -2924,7 +2894,7 @@
           <w:sz w:val="21"/>
           <w:szCs w:val="21"/>
         </w:rPr>
-        <w:t xml:space="preserve">Code and tools decide facts. A critic LLM judges meaning.</w:t>
+        <w:t>Code and tools decide facts. A critic LLM judges meaning.</w:t>
       </w:r>
     </w:p>
     <w:p>
@@ -2934,13 +2904,12 @@
       <w:r>
         <w:rPr>
           <w:rFonts w:ascii="Open Sans" w:hAnsi="Open Sans" w:cs="Open Sans"/>
-          <w:b/>
           <w:bCs/>
           <w:color w:val="000000"/>
           <w:sz w:val="21"/>
           <w:szCs w:val="21"/>
         </w:rPr>
-        <w:t xml:space="preserve">Layer 1: pass/fail gates (code and tool calls), applied to every claim before any scoring.</w:t>
+        <w:t>Layer 1: pass/fail gates (code and tool calls), applied to every claim before any scoring.</w:t>
       </w:r>
     </w:p>
     <w:tbl>
@@ -2985,13 +2954,12 @@
             <w:r>
               <w:rPr>
                 <w:rFonts w:ascii="Open Sans" w:hAnsi="Open Sans" w:cs="Open Sans"/>
-                <w:b/>
                 <w:bCs/>
                 <w:color w:val="FFFFFF"/>
                 <w:sz w:val="18"/>
                 <w:szCs w:val="18"/>
               </w:rPr>
-              <w:t xml:space="preserve">Gate</w:t>
+              <w:t>Gate</w:t>
             </w:r>
           </w:p>
         </w:tc>
@@ -3007,13 +2975,12 @@
             <w:r>
               <w:rPr>
                 <w:rFonts w:ascii="Open Sans" w:hAnsi="Open Sans" w:cs="Open Sans"/>
-                <w:b/>
                 <w:bCs/>
                 <w:color w:val="FFFFFF"/>
                 <w:sz w:val="18"/>
                 <w:szCs w:val="18"/>
               </w:rPr>
-              <w:t xml:space="preserve">Check</w:t>
+              <w:t>Check</w:t>
             </w:r>
           </w:p>
         </w:tc>
@@ -3029,13 +2996,12 @@
             <w:r>
               <w:rPr>
                 <w:rFonts w:ascii="Open Sans" w:hAnsi="Open Sans" w:cs="Open Sans"/>
-                <w:b/>
                 <w:bCs/>
                 <w:color w:val="FFFFFF"/>
                 <w:sz w:val="18"/>
                 <w:szCs w:val="18"/>
               </w:rPr>
-              <w:t xml:space="preserve">Done by</w:t>
+              <w:t>Done by</w:t>
             </w:r>
           </w:p>
         </w:tc>
@@ -3060,7 +3026,7 @@
                 <w:sz w:val="18"/>
                 <w:szCs w:val="18"/>
               </w:rPr>
-              <w:t xml:space="preserve">Well-formed</w:t>
+              <w:t>Well-formed</w:t>
             </w:r>
           </w:p>
         </w:tc>
@@ -3080,7 +3046,7 @@
                 <w:sz w:val="18"/>
                 <w:szCs w:val="18"/>
               </w:rPr>
-              <w:t xml:space="preserve">Metric, comparison, threshold, period and source are all present</w:t>
+              <w:t>Metric, comparison, threshold, period and source are all present</w:t>
             </w:r>
           </w:p>
         </w:tc>
@@ -3100,7 +3066,7 @@
                 <w:sz w:val="18"/>
                 <w:szCs w:val="18"/>
               </w:rPr>
-              <w:t xml:space="preserve">Pydantic schema</w:t>
+              <w:t>Pydantic schema</w:t>
             </w:r>
           </w:p>
         </w:tc>
@@ -3126,7 +3092,7 @@
                 <w:sz w:val="18"/>
                 <w:szCs w:val="18"/>
               </w:rPr>
-              <w:t xml:space="preserve">No price claims</w:t>
+              <w:t>No price claims</w:t>
             </w:r>
           </w:p>
         </w:tc>
@@ -3147,7 +3113,7 @@
                 <w:sz w:val="18"/>
                 <w:szCs w:val="18"/>
               </w:rPr>
-              <w:t xml:space="preserve">No stock price, valuation multiple or price target. Also applied to each reading’s outcome</w:t>
+              <w:t>No stock price, valuation multiple or price target. Also applied to each reading’s outcome</w:t>
             </w:r>
           </w:p>
         </w:tc>
@@ -3168,7 +3134,7 @@
                 <w:sz w:val="18"/>
                 <w:szCs w:val="18"/>
               </w:rPr>
-              <w:t xml:space="preserve">Rule check</w:t>
+              <w:t>Rule check</w:t>
             </w:r>
           </w:p>
         </w:tc>
@@ -3193,7 +3159,7 @@
                 <w:sz w:val="18"/>
                 <w:szCs w:val="18"/>
               </w:rPr>
-              <w:t xml:space="preserve">Investor’s numbers kept</w:t>
+              <w:t>Investor’s numbers kept</w:t>
             </w:r>
           </w:p>
         </w:tc>
@@ -3213,7 +3179,7 @@
                 <w:sz w:val="18"/>
                 <w:szCs w:val="18"/>
               </w:rPr>
-              <w:t xml:space="preserve">Every threshold in the thesis appears unchanged in the claims</w:t>
+              <w:t>Every threshold in the thesis appears unchanged in the claims</w:t>
             </w:r>
           </w:p>
         </w:tc>
@@ -3233,7 +3199,7 @@
                 <w:sz w:val="18"/>
                 <w:szCs w:val="18"/>
               </w:rPr>
-              <w:t xml:space="preserve">Code</w:t>
+              <w:t>Code</w:t>
             </w:r>
           </w:p>
         </w:tc>
@@ -3259,7 +3225,7 @@
                 <w:sz w:val="18"/>
                 <w:szCs w:val="18"/>
               </w:rPr>
-              <w:t xml:space="preserve">Testable</w:t>
+              <w:t>Testable</w:t>
             </w:r>
           </w:p>
         </w:tc>
@@ -3290,7 +3256,7 @@
                 <w:sz w:val="16"/>
                 <w:szCs w:val="16"/>
               </w:rPr>
-              <w:t xml:space="preserve">search_filings</w:t>
+              <w:t>search_filings</w:t>
             </w:r>
             <w:r>
               <w:rPr>
@@ -3321,7 +3287,7 @@
                 <w:sz w:val="18"/>
                 <w:szCs w:val="18"/>
               </w:rPr>
-              <w:t xml:space="preserve">Tool probes</w:t>
+              <w:t>Tool probes</w:t>
             </w:r>
           </w:p>
         </w:tc>
@@ -3344,7 +3310,7 @@
           <w:sz w:val="21"/>
           <w:szCs w:val="21"/>
         </w:rPr>
-        <w:t xml:space="preserve">The probes answer “can this be tested?”, never “would it pass?” They return found or not found, never the figure or the passage. If the critic saw outcomes, the search would drift toward claims with a known result: choosing the test after seeing the answers.</w:t>
+        <w:t>The probes answer “can this be tested?”, never “would it pass?” They return found or not found, never the figure or the passage. If the critic saw outcomes, the search would drift toward claims with a known result: choosing the test after seeing the answers.</w:t>
       </w:r>
     </w:p>
     <w:p>
@@ -3354,13 +3320,12 @@
       <w:r>
         <w:rPr>
           <w:rFonts w:ascii="Open Sans" w:hAnsi="Open Sans" w:cs="Open Sans"/>
-          <w:b/>
           <w:bCs/>
           <w:color w:val="000000"/>
           <w:sz w:val="21"/>
           <w:szCs w:val="21"/>
         </w:rPr>
-        <w:t xml:space="preserve">Layer 2: critic scores (LLM, 1–5 per criterion).</w:t>
+        <w:t>Layer 2: critic scores (LLM, 1–5 per criterion).</w:t>
       </w:r>
     </w:p>
     <w:tbl>
@@ -3406,13 +3371,12 @@
             <w:r>
               <w:rPr>
                 <w:rFonts w:ascii="Open Sans" w:hAnsi="Open Sans" w:cs="Open Sans"/>
-                <w:b/>
                 <w:bCs/>
                 <w:color w:val="FFFFFF"/>
                 <w:sz w:val="18"/>
                 <w:szCs w:val="18"/>
               </w:rPr>
-              <w:t xml:space="preserve">Criterion</w:t>
+              <w:t>Criterion</w:t>
             </w:r>
           </w:p>
         </w:tc>
@@ -3428,13 +3392,12 @@
             <w:r>
               <w:rPr>
                 <w:rFonts w:ascii="Open Sans" w:hAnsi="Open Sans" w:cs="Open Sans"/>
-                <w:b/>
                 <w:bCs/>
                 <w:color w:val="FFFFFF"/>
                 <w:sz w:val="18"/>
                 <w:szCs w:val="18"/>
               </w:rPr>
-              <w:t xml:space="preserve">Weight</w:t>
+              <w:t>Weight</w:t>
             </w:r>
           </w:p>
         </w:tc>
@@ -3450,13 +3413,12 @@
             <w:r>
               <w:rPr>
                 <w:rFonts w:ascii="Open Sans" w:hAnsi="Open Sans" w:cs="Open Sans"/>
-                <w:b/>
                 <w:bCs/>
                 <w:color w:val="FFFFFF"/>
                 <w:sz w:val="18"/>
                 <w:szCs w:val="18"/>
               </w:rPr>
-              <w:t xml:space="preserve">5 means</w:t>
+              <w:t>5 means</w:t>
             </w:r>
           </w:p>
         </w:tc>
@@ -3472,13 +3434,12 @@
             <w:r>
               <w:rPr>
                 <w:rFonts w:ascii="Open Sans" w:hAnsi="Open Sans" w:cs="Open Sans"/>
-                <w:b/>
                 <w:bCs/>
                 <w:color w:val="FFFFFF"/>
                 <w:sz w:val="18"/>
                 <w:szCs w:val="18"/>
               </w:rPr>
-              <w:t xml:space="preserve">1 means</w:t>
+              <w:t>1 means</w:t>
             </w:r>
           </w:p>
         </w:tc>
@@ -3503,7 +3464,7 @@
                 <w:sz w:val="18"/>
                 <w:szCs w:val="18"/>
               </w:rPr>
-              <w:t xml:space="preserve">Faithful</w:t>
+              <w:t>Faithful</w:t>
             </w:r>
           </w:p>
         </w:tc>
@@ -3523,7 +3484,7 @@
                 <w:sz w:val="18"/>
                 <w:szCs w:val="18"/>
               </w:rPr>
-              <w:t xml:space="preserve">30%</w:t>
+              <w:t>30%</w:t>
             </w:r>
           </w:p>
         </w:tc>
@@ -3543,7 +3504,7 @@
                 <w:sz w:val="18"/>
                 <w:szCs w:val="18"/>
               </w:rPr>
-              <w:t xml:space="preserve">Tests the belief as stated, with the investor’s metric and time frame</w:t>
+              <w:t>Tests the belief as stated, with the investor’s metric and time frame</w:t>
             </w:r>
           </w:p>
         </w:tc>
@@ -3563,7 +3524,7 @@
                 <w:sz w:val="18"/>
                 <w:szCs w:val="18"/>
               </w:rPr>
-              <w:t xml:space="preserve">Tests a different, easier belief</w:t>
+              <w:t>Tests a different, easier belief</w:t>
             </w:r>
           </w:p>
         </w:tc>
@@ -3589,7 +3550,7 @@
                 <w:sz w:val="18"/>
                 <w:szCs w:val="18"/>
               </w:rPr>
-              <w:t xml:space="preserve">Covers the chain</w:t>
+              <w:t>Covers the chain</w:t>
             </w:r>
           </w:p>
         </w:tc>
@@ -3610,7 +3571,7 @@
                 <w:sz w:val="18"/>
                 <w:szCs w:val="18"/>
               </w:rPr>
-              <w:t xml:space="preserve">25%</w:t>
+              <w:t>25%</w:t>
             </w:r>
           </w:p>
         </w:tc>
@@ -3631,7 +3592,7 @@
                 <w:sz w:val="18"/>
                 <w:szCs w:val="18"/>
               </w:rPr>
-              <w:t xml:space="preserve">Every link from driver to outcome has a claim</w:t>
+              <w:t>Every link from driver to outcome has a claim</w:t>
             </w:r>
           </w:p>
         </w:tc>
@@ -3652,7 +3613,7 @@
                 <w:sz w:val="18"/>
                 <w:szCs w:val="18"/>
               </w:rPr>
-              <w:t xml:space="preserve">Only the outcome is tested</w:t>
+              <w:t>Only the outcome is tested</w:t>
             </w:r>
           </w:p>
         </w:tc>
@@ -3677,7 +3638,7 @@
                 <w:sz w:val="18"/>
                 <w:szCs w:val="18"/>
               </w:rPr>
-              <w:t xml:space="preserve">Could fail</w:t>
+              <w:t>Could fail</w:t>
             </w:r>
           </w:p>
         </w:tc>
@@ -3697,7 +3658,7 @@
                 <w:sz w:val="18"/>
                 <w:szCs w:val="18"/>
               </w:rPr>
-              <w:t xml:space="preserve">25%</w:t>
+              <w:t>25%</w:t>
             </w:r>
           </w:p>
         </w:tc>
@@ -3717,7 +3678,7 @@
                 <w:sz w:val="18"/>
                 <w:szCs w:val="18"/>
               </w:rPr>
-              <w:t xml:space="preserve">At least one claim could plausibly fail on the next filing</w:t>
+              <w:t>At least one claim could plausibly fail on the next filing</w:t>
             </w:r>
           </w:p>
         </w:tc>
@@ -3737,7 +3698,7 @@
                 <w:sz w:val="18"/>
                 <w:szCs w:val="18"/>
               </w:rPr>
-              <w:t xml:space="preserve">Every claim passes whatever the results, e.g., “management discusses AI”</w:t>
+              <w:t>Every claim passes whatever the results, e.g., “management discusses AI”</w:t>
             </w:r>
           </w:p>
         </w:tc>
@@ -3763,7 +3724,7 @@
                 <w:sz w:val="18"/>
                 <w:szCs w:val="18"/>
               </w:rPr>
-              <w:t xml:space="preserve">Distinct</w:t>
+              <w:t>Distinct</w:t>
             </w:r>
           </w:p>
         </w:tc>
@@ -3784,7 +3745,7 @@
                 <w:sz w:val="18"/>
                 <w:szCs w:val="18"/>
               </w:rPr>
-              <w:t xml:space="preserve">10%</w:t>
+              <w:t>10%</w:t>
             </w:r>
           </w:p>
         </w:tc>
@@ -3805,7 +3766,7 @@
                 <w:sz w:val="18"/>
                 <w:szCs w:val="18"/>
               </w:rPr>
-              <w:t xml:space="preserve">Each claim measures something different</w:t>
+              <w:t>Each claim measures something different</w:t>
             </w:r>
           </w:p>
         </w:tc>
@@ -3826,7 +3787,7 @@
                 <w:sz w:val="18"/>
                 <w:szCs w:val="18"/>
               </w:rPr>
-              <w:t xml:space="preserve">Two claims measure the same thing, e.g., gross margin and gross-profit growth</w:t>
+              <w:t>Two claims measure the same thing, e.g., gross margin and gross-profit growth</w:t>
             </w:r>
           </w:p>
         </w:tc>
@@ -3851,7 +3812,7 @@
                 <w:sz w:val="18"/>
                 <w:szCs w:val="18"/>
               </w:rPr>
-              <w:t xml:space="preserve">Clear</w:t>
+              <w:t>Clear</w:t>
             </w:r>
           </w:p>
         </w:tc>
@@ -3871,7 +3832,7 @@
                 <w:sz w:val="18"/>
                 <w:szCs w:val="18"/>
               </w:rPr>
-              <w:t xml:space="preserve">10%</w:t>
+              <w:t>10%</w:t>
             </w:r>
           </w:p>
         </w:tc>
@@ -3891,7 +3852,7 @@
                 <w:sz w:val="18"/>
                 <w:szCs w:val="18"/>
               </w:rPr>
-              <w:t xml:space="preserve">The investor can confirm it in one read</w:t>
+              <w:t>The investor can confirm it in one read</w:t>
             </w:r>
           </w:p>
         </w:tc>
@@ -3911,7 +3872,7 @@
                 <w:sz w:val="18"/>
                 <w:szCs w:val="18"/>
               </w:rPr>
-              <w:t xml:space="preserve">Needs a finance background to follow</w:t>
+              <w:t>Needs a finance background to follow</w:t>
             </w:r>
           </w:p>
         </w:tc>
@@ -3934,7 +3895,18 @@
           <w:sz w:val="21"/>
           <w:szCs w:val="21"/>
         </w:rPr>
-        <w:t xml:space="preserve">Readings at depth 1 have no claims yet, so they’re scored on Faithful (60%) and Covers the chain (40%) only. “Could fail” is the bias check. A linear chain and the investor both drift toward claims that are easy to pass, and this criterion pushes back. It rewards claims that </w:t>
+        <w:t xml:space="preserve">Readings at depth 1 have no claims yet, so they’re scored on Faithful (60%) and Covers the chain (40%) only. “Could fail” is the bias check. A linear chain and the investor both drift toward claims </w:t>
+      </w:r>
+      <w:r>
+        <w:rPr>
+          <w:rFonts w:ascii="Open Sans" w:hAnsi="Open Sans" w:cs="Open Sans"/>
+          <w:b w:val="0"/>
+          <w:color w:val="000000"/>
+          <w:sz w:val="21"/>
+          <w:szCs w:val="21"/>
+        </w:rPr>
+        <w:lastRenderedPageBreak/>
+        <w:t xml:space="preserve">that are easy to pass, and this criterion pushes back. It rewards claims that </w:t>
       </w:r>
       <w:r>
         <w:rPr>
@@ -3946,7 +3918,7 @@
           <w:sz w:val="21"/>
           <w:szCs w:val="21"/>
         </w:rPr>
-        <w:t xml:space="preserve">could</w:t>
+        <w:t>could</w:t>
       </w:r>
       <w:r>
         <w:rPr>
@@ -3966,13 +3938,12 @@
       <w:r>
         <w:rPr>
           <w:rFonts w:ascii="Open Sans" w:hAnsi="Open Sans" w:cs="Open Sans"/>
-          <w:b/>
           <w:bCs/>
           <w:color w:val="000000"/>
           <w:sz w:val="21"/>
           <w:szCs w:val="21"/>
         </w:rPr>
-        <w:t xml:space="preserve">Who evaluates.</w:t>
+        <w:t>Who evaluates.</w:t>
       </w:r>
       <w:r>
         <w:rPr>
@@ -3987,13 +3958,12 @@
       <w:r>
         <w:rPr>
           <w:rFonts w:ascii="Open Sans" w:hAnsi="Open Sans" w:cs="Open Sans"/>
-          <w:b/>
           <w:bCs/>
           <w:color w:val="000000"/>
           <w:sz w:val="21"/>
           <w:szCs w:val="21"/>
         </w:rPr>
-        <w:t xml:space="preserve">Claim Critic</w:t>
+        <w:t>Claim Critic</w:t>
       </w:r>
       <w:r>
         <w:rPr>
@@ -4003,7 +3973,7 @@
           <w:sz w:val="21"/>
           <w:szCs w:val="21"/>
         </w:rPr>
-        <w:t xml:space="preserve">, a separate LLM role with its own prompt, at temperature 0. The decision maker then applies the thresholds below to their results. The critic sees only the thesis and one candidate, never the generator’s reasoning or the other candidates, so neither order nor anchoring can sway a score. It also never sees the investor’s past claim edits. Those can guide how the generator drafts claims, but they can’t lower the bar for “Could fail.” This follows Checkpoint 2.1’s rule that overrides are preferences, not evidence.</w:t>
+        <w:t>, a separate LLM role with its own prompt, at temperature 0. The decision maker then applies the thresholds below to their results. The critic sees only the thesis and one candidate, never the generator’s reasoning or the other candidates, so neither order nor anchoring can sway a score. It also never sees the investor’s past claim edits. Those can guide how the generator drafts claims, but they can’t lower the bar for “Could fail.” This follows Checkpoint 2.1’s rule that overrides are preferences, not evidence.</w:t>
       </w:r>
     </w:p>
     <w:p>
@@ -4013,13 +3983,12 @@
       <w:r>
         <w:rPr>
           <w:rFonts w:ascii="Open Sans" w:hAnsi="Open Sans" w:cs="Open Sans"/>
-          <w:b/>
           <w:bCs/>
           <w:color w:val="000000"/>
           <w:sz w:val="21"/>
           <w:szCs w:val="21"/>
         </w:rPr>
-        <w:t xml:space="preserve">Pruning thresholds and failure conditions.</w:t>
+        <w:t>Pruning thresholds and failure conditions.</w:t>
       </w:r>
     </w:p>
     <w:p>
@@ -4038,7 +4007,7 @@
           <w:sz w:val="21"/>
           <w:szCs w:val="21"/>
         </w:rPr>
-        <w:t xml:space="preserve">A claim that fails a gate is dropped from its set.</w:t>
+        <w:t>A claim that fails a gate is dropped from its set.</w:t>
       </w:r>
     </w:p>
     <w:p>
@@ -4057,7 +4026,7 @@
           <w:sz w:val="21"/>
           <w:szCs w:val="21"/>
         </w:rPr>
-        <w:t xml:space="preserve">Depth 1: a reading is pruned if its outcome is price-based or it scores Faithful &lt; 3. The top 2 survivors move on.</w:t>
+        <w:t>Depth 1: a reading is pruned if its outcome is price-based or it scores Faithful &lt; 3. The top 2 survivors move on.</w:t>
       </w:r>
     </w:p>
     <w:p>
@@ -4076,7 +4045,7 @@
           <w:sz w:val="21"/>
           <w:szCs w:val="21"/>
         </w:rPr>
-        <w:t xml:space="preserve">Depth 2: a claim set is pruned if fewer than 3 claims survive the gates, its outcome claim is dropped, it scores Faithful &lt; 3, or its weighted score is below 3.5.</w:t>
+        <w:t>Depth 2: a claim set is pruned if fewer than 3 claims survive the gates, its outcome claim is dropped, it scores Faithful &lt; 3, or its weighted score is below 3.5.</w:t>
       </w:r>
     </w:p>
     <w:p>
@@ -4095,7 +4064,7 @@
           <w:sz w:val="21"/>
           <w:szCs w:val="21"/>
         </w:rPr>
-        <w:t xml:space="preserve">Nothing survives: the Thesis Analyst asks one clarifying question built from the failure reason (“This company doesn’t report AI chip sales separately. Would data-center revenue work?”) and reruns once. This question counts toward 2.1’s limit of 2–3 clarifying questions. If nothing survives again, the result is “Untestable as stated,” with the failed gates shown so the investor can rephrase.</w:t>
+        <w:t>Nothing survives: the Thesis Analyst asks one clarifying question built from the failure reason (“This company doesn’t report AI chip sales separately. Would data-center revenue work?”) and reruns once. This question counts toward 2.1’s limit of 2–3 clarifying questions. If nothing survives again, the result is “Untestable as stated,” with the failed gates shown so the investor can rephrase.</w:t>
       </w:r>
     </w:p>
     <w:p>
@@ -4114,7 +4083,7 @@
           <w:sz w:val="21"/>
           <w:szCs w:val="21"/>
         </w:rPr>
-        <w:t xml:space="preserve">Budget exhausted: the best surviving claim set is shown, flagged as a partial search.</w:t>
+        <w:t>Budget exhausted: the best surviving claim set is shown, flagged as a partial search.</w:t>
       </w:r>
     </w:p>
     <w:p>
@@ -4133,7 +4102,7 @@
           <w:sz w:val="21"/>
           <w:szCs w:val="21"/>
         </w:rPr>
-        <w:t xml:space="preserve">Critic output fails schema validation twice: the system falls back to one linear decomposition through the same gates, and logs it.</w:t>
+        <w:t>Critic output fails schema validation twice: the system falls back to one linear decomposition through the same gates, and logs it.</w:t>
       </w:r>
     </w:p>
     <w:p>
@@ -4152,7 +4121,7 @@
           <w:sz w:val="21"/>
           <w:szCs w:val="21"/>
         </w:rPr>
-        <w:t xml:space="preserve">A pruned node is marked with its reason and never expanded. It stays in the run log.</w:t>
+        <w:t>A pruned node is marked with its reason and never expanded. It stays in the run log.</w:t>
       </w:r>
     </w:p>
     <w:p>
@@ -4162,13 +4131,12 @@
       <w:r>
         <w:rPr>
           <w:rFonts w:ascii="Open Sans" w:hAnsi="Open Sans" w:cs="Open Sans"/>
-          <w:b/>
           <w:bCs/>
           <w:color w:val="000000"/>
           <w:sz w:val="21"/>
           <w:szCs w:val="21"/>
         </w:rPr>
-        <w:t xml:space="preserve">Ties.</w:t>
+        <w:t>Ties.</w:t>
       </w:r>
       <w:r>
         <w:rPr>
@@ -4192,13 +4160,12 @@
       <w:r>
         <w:rPr>
           <w:rFonts w:ascii="Open Sans" w:hAnsi="Open Sans" w:cs="Open Sans"/>
-          <w:b/>
           <w:bCs/>
           <w:color w:val="000000"/>
           <w:sz w:val="21"/>
           <w:szCs w:val="21"/>
         </w:rPr>
-        <w:t xml:space="preserve">Different readings:</w:t>
+        <w:t>Different readings:</w:t>
       </w:r>
       <w:r>
         <w:rPr>
@@ -4222,13 +4189,12 @@
       <w:r>
         <w:rPr>
           <w:rFonts w:ascii="Open Sans" w:hAnsi="Open Sans" w:cs="Open Sans"/>
-          <w:b/>
           <w:bCs/>
           <w:color w:val="000000"/>
           <w:sz w:val="21"/>
           <w:szCs w:val="21"/>
         </w:rPr>
-        <w:t xml:space="preserve">Same reading:</w:t>
+        <w:t>Same reading:</w:t>
       </w:r>
       <w:r>
         <w:rPr>
@@ -4248,13 +4214,12 @@
       <w:r>
         <w:rPr>
           <w:rFonts w:ascii="Open Sans" w:hAnsi="Open Sans" w:cs="Open Sans"/>
-          <w:b/>
           <w:bCs/>
           <w:color w:val="000000"/>
           <w:sz w:val="21"/>
           <w:szCs w:val="21"/>
         </w:rPr>
-        <w:t xml:space="preserve">Compute, latency and cost (estimates, to be measured).</w:t>
+        <w:t>Compute, latency and cost (estimates, to be measured).</w:t>
       </w:r>
     </w:p>
     <w:tbl>
@@ -4298,13 +4263,12 @@
             <w:r>
               <w:rPr>
                 <w:rFonts w:ascii="Open Sans" w:hAnsi="Open Sans" w:cs="Open Sans"/>
-                <w:b/>
                 <w:bCs/>
                 <w:color w:val="FFFFFF"/>
                 <w:sz w:val="18"/>
                 <w:szCs w:val="18"/>
               </w:rPr>
-              <w:t xml:space="preserve">Limit</w:t>
+              <w:t>Limit</w:t>
             </w:r>
           </w:p>
         </w:tc>
@@ -4320,13 +4284,12 @@
             <w:r>
               <w:rPr>
                 <w:rFonts w:ascii="Open Sans" w:hAnsi="Open Sans" w:cs="Open Sans"/>
-                <w:b/>
                 <w:bCs/>
                 <w:color w:val="FFFFFF"/>
                 <w:sz w:val="18"/>
                 <w:szCs w:val="18"/>
               </w:rPr>
-              <w:t xml:space="preserve">Value</w:t>
+              <w:t>Value</w:t>
             </w:r>
           </w:p>
         </w:tc>
@@ -4351,7 +4314,7 @@
                 <w:sz w:val="18"/>
                 <w:szCs w:val="18"/>
               </w:rPr>
-              <w:t xml:space="preserve">LLM calls</w:t>
+              <w:t>LLM calls</w:t>
             </w:r>
           </w:p>
         </w:tc>
@@ -4371,7 +4334,7 @@
                 <w:sz w:val="18"/>
                 <w:szCs w:val="18"/>
               </w:rPr>
-              <w:t xml:space="preserve">12 planned (3 generator calls and 9 critic calls); hard cap of 14 to allow retries</w:t>
+              <w:t>12 planned (3 generator calls and 9 critic calls); hard cap of 14 to allow retries</w:t>
             </w:r>
           </w:p>
         </w:tc>
@@ -4397,7 +4360,8 @@
                 <w:sz w:val="18"/>
                 <w:szCs w:val="18"/>
               </w:rPr>
-              <w:t xml:space="preserve">Tool probes</w:t>
+              <w:lastRenderedPageBreak/>
+              <w:t>Tool probes</w:t>
             </w:r>
           </w:p>
         </w:tc>
@@ -4418,7 +4382,7 @@
                 <w:sz w:val="18"/>
                 <w:szCs w:val="18"/>
               </w:rPr>
-              <w:t xml:space="preserve">At most 20, deduplicated by metric and period. Numeric probes are local lookups in the company’s cached XBRL data</w:t>
+              <w:t>At most 20, deduplicated by metric and period. Numeric probes are local lookups in the company’s cached XBRL data</w:t>
             </w:r>
           </w:p>
         </w:tc>
@@ -4443,7 +4407,7 @@
                 <w:sz w:val="18"/>
                 <w:szCs w:val="18"/>
               </w:rPr>
-              <w:t xml:space="preserve">Tokens</w:t>
+              <w:t>Tokens</w:t>
             </w:r>
           </w:p>
         </w:tc>
@@ -4463,7 +4427,7 @@
                 <w:sz w:val="18"/>
                 <w:szCs w:val="18"/>
               </w:rPr>
-              <w:t xml:space="preserve">Short prompts (a thesis and one candidate, no filing text); cap of about 30k tokens per search</w:t>
+              <w:t>Short prompts (a thesis and one candidate, no filing text); cap of about 30k tokens per search</w:t>
             </w:r>
           </w:p>
         </w:tc>
@@ -4489,7 +4453,7 @@
                 <w:sz w:val="18"/>
                 <w:szCs w:val="18"/>
               </w:rPr>
-              <w:t xml:space="preserve">Latency</w:t>
+              <w:t>Latency</w:t>
             </w:r>
           </w:p>
         </w:tc>
@@ -4510,7 +4474,7 @@
                 <w:sz w:val="18"/>
                 <w:szCs w:val="18"/>
               </w:rPr>
-              <w:t xml:space="preserve">Calls run in parallel within each level, so there are 4 sequential rounds; target under 20 seconds before the confirmation screen</w:t>
+              <w:t>Calls run in parallel within each level, so there are 4 sequential rounds; target under 20 seconds before the confirmation screen</w:t>
             </w:r>
           </w:p>
         </w:tc>
@@ -4535,7 +4499,7 @@
                 <w:sz w:val="18"/>
                 <w:szCs w:val="18"/>
               </w:rPr>
-              <w:t xml:space="preserve">Frequency</w:t>
+              <w:t>Frequency</w:t>
             </w:r>
           </w:p>
         </w:tc>
@@ -4555,7 +4519,7 @@
                 <w:sz w:val="18"/>
                 <w:szCs w:val="18"/>
               </w:rPr>
-              <w:t xml:space="preserve">Once per new or edited thesis, never on quarterly re-checks</w:t>
+              <w:t>Once per new or edited thesis, never on quarterly re-checks</w:t>
             </w:r>
           </w:p>
         </w:tc>
@@ -4577,13 +4541,12 @@
       <w:r>
         <w:rPr>
           <w:rFonts w:ascii="Open Sans" w:hAnsi="Open Sans" w:cs="Open Sans"/>
-          <w:b/>
           <w:bCs/>
           <w:color w:val="A6192E"/>
           <w:sz w:val="25"/>
           <w:szCs w:val="25"/>
         </w:rPr>
-        <w:t xml:space="preserve">5. ToT in action</w:t>
+        <w:t>5. ToT in action</w:t>
       </w:r>
     </w:p>
     <w:p>
@@ -4610,7 +4573,7 @@
           <w:sz w:val="18"/>
           <w:szCs w:val="18"/>
         </w:rPr>
-        <w:t xml:space="preserve">(Illustrative; scores and data availability are hypothetical.)</w:t>
+        <w:t>(Illustrative; scores and data availability are hypothetical.)</w:t>
       </w:r>
     </w:p>
     <w:p>
@@ -4629,7 +4592,7 @@
           <w:sz w:val="21"/>
           <w:szCs w:val="21"/>
         </w:rPr>
-        <w:t xml:space="preserve">The generator proposes three readings. The critic scores mix shift (R2) 4.6 and pricing power (R1) 4.4. Guidance only (R3) scores 3.0: it tests the forecast but not the demand behind it, so it ranks third and the beam drops it. The outlook doesn’t disappear; it comes back as a claim under R2.</w:t>
+        <w:t>The generator proposes three readings. The critic scores mix shift (R2) 4.6 and pricing power (R1) 4.4. Guidance only (R3) scores 3.0: it tests the forecast but not the demand behind it, so it ranks third and the beam drops it. The outlook doesn’t disappear; it comes back as a claim under R2.</w:t>
       </w:r>
     </w:p>
     <w:p>
@@ -4648,7 +4611,7 @@
           <w:sz w:val="21"/>
           <w:szCs w:val="21"/>
         </w:rPr>
-        <w:t xml:space="preserve">For each kept reading, the generator proposes three claim sets. Under R2:</w:t>
+        <w:t>For each kept reading, the generator proposes three claim sets. Under R2:</w:t>
       </w:r>
     </w:p>
     <w:p>
@@ -4662,13 +4625,12 @@
       <w:r>
         <w:rPr>
           <w:rFonts w:ascii="Open Sans" w:hAnsi="Open Sans" w:cs="Open Sans"/>
-          <w:b/>
           <w:bCs/>
           <w:color w:val="000000"/>
           <w:sz w:val="21"/>
           <w:szCs w:val="21"/>
         </w:rPr>
-        <w:t xml:space="preserve">S2a:</w:t>
+        <w:t>S2a:</w:t>
       </w:r>
       <w:r>
         <w:rPr>
@@ -4692,13 +4654,12 @@
       <w:r>
         <w:rPr>
           <w:rFonts w:ascii="Open Sans" w:hAnsi="Open Sans" w:cs="Open Sans"/>
-          <w:b/>
           <w:bCs/>
           <w:color w:val="000000"/>
           <w:sz w:val="21"/>
           <w:szCs w:val="21"/>
         </w:rPr>
-        <w:t xml:space="preserve">S2b</w:t>
+        <w:t>S2b</w:t>
       </w:r>
       <w:r>
         <w:rPr>
@@ -4722,13 +4683,12 @@
       <w:r>
         <w:rPr>
           <w:rFonts w:ascii="Open Sans" w:hAnsi="Open Sans" w:cs="Open Sans"/>
-          <w:b/>
           <w:bCs/>
           <w:color w:val="000000"/>
           <w:sz w:val="21"/>
           <w:szCs w:val="21"/>
         </w:rPr>
-        <w:t xml:space="preserve">S2c</w:t>
+        <w:t>S2c</w:t>
       </w:r>
       <w:r>
         <w:rPr>
@@ -4757,7 +4717,7 @@
           <w:sz w:val="21"/>
           <w:szCs w:val="21"/>
         </w:rPr>
-        <w:t xml:space="preserve">S2a scores 4.55, ahead of S2c (4.0) and R1’s best set (4.2). The gap is wider than the 0.25 tie margin, so S2a is shown alone, with each claim’s source.</w:t>
+        <w:t>S2a scores 4.55, ahead of S2c (4.0) and R1’s best set (4.2). The gap is wider than the 0.25 tie margin, so S2a is shown alone, with each claim’s source.</w:t>
       </w:r>
     </w:p>
     <w:p>
@@ -4776,7 +4736,7 @@
           <w:sz w:val="21"/>
           <w:szCs w:val="21"/>
         </w:rPr>
-        <w:t xml:space="preserve">The investor confirms. The tree, with every score and pruning reason, goes to the run log.</w:t>
+        <w:t>The investor confirms. The tree, with every score and pruning reason, goes to the run log.</w:t>
       </w:r>
     </w:p>
     <w:p>
@@ -4791,7 +4751,7 @@
           <w:sz w:val="21"/>
           <w:szCs w:val="21"/>
         </w:rPr>
-        <w:t xml:space="preserve">A linear chain of thought might produce “gross margin above 60% last quarter, revenue growing, management positive on AI demand.” It misses guidance, and its third claim can’t fail. If last quarter’s margin, though lower, is still above 60% while guidance has fallen to 58% (Checkpoint 3.1’s example), that set says Intact. S2a includes the outlook claim, which comes back Broken.</w:t>
+        <w:t>A linear chain of thought might produce “gross margin above 60% last quarter, revenue growing, management positive on AI demand.” It misses guidance, and its third claim can’t fail. If last quarter’s margin, though lower, is still above 60% while guidance has fallen to 58% (Checkpoint 3.1’s example), that set says Intact. S2a includes the outlook claim, which comes back Broken.</w:t>
       </w:r>
     </w:p>
     <w:p>
@@ -4805,13 +4765,13 @@
       <w:r>
         <w:rPr>
           <w:rFonts w:ascii="Open Sans" w:hAnsi="Open Sans" w:cs="Open Sans"/>
-          <w:b/>
           <w:bCs/>
           <w:color w:val="A6192E"/>
           <w:sz w:val="25"/>
           <w:szCs w:val="25"/>
         </w:rPr>
-        <w:t xml:space="preserve">6. Mapping ToT roles to tools</w:t>
+        <w:lastRenderedPageBreak/>
+        <w:t>6. Mapping ToT roles to tools</w:t>
       </w:r>
     </w:p>
     <w:p>
@@ -4821,13 +4781,12 @@
       <w:r>
         <w:rPr>
           <w:rFonts w:ascii="Open Sans" w:hAnsi="Open Sans" w:cs="Open Sans"/>
-          <w:b/>
           <w:bCs/>
           <w:color w:val="000000"/>
           <w:sz w:val="21"/>
           <w:szCs w:val="21"/>
         </w:rPr>
-        <w:t xml:space="preserve">Role definitions.</w:t>
+        <w:t>Role definitions.</w:t>
       </w:r>
       <w:r>
         <w:rPr>
@@ -4884,13 +4843,12 @@
             <w:r>
               <w:rPr>
                 <w:rFonts w:ascii="Open Sans" w:hAnsi="Open Sans" w:cs="Open Sans"/>
-                <w:b/>
                 <w:bCs/>
                 <w:color w:val="FFFFFF"/>
                 <w:sz w:val="18"/>
                 <w:szCs w:val="18"/>
               </w:rPr>
-              <w:t xml:space="preserve">Role</w:t>
+              <w:t>Role</w:t>
             </w:r>
           </w:p>
         </w:tc>
@@ -4906,13 +4864,12 @@
             <w:r>
               <w:rPr>
                 <w:rFonts w:ascii="Open Sans" w:hAnsi="Open Sans" w:cs="Open Sans"/>
-                <w:b/>
                 <w:bCs/>
                 <w:color w:val="FFFFFF"/>
                 <w:sz w:val="18"/>
                 <w:szCs w:val="18"/>
               </w:rPr>
-              <w:t xml:space="preserve">Goal</w:t>
+              <w:t>Goal</w:t>
             </w:r>
           </w:p>
         </w:tc>
@@ -4928,13 +4885,12 @@
             <w:r>
               <w:rPr>
                 <w:rFonts w:ascii="Open Sans" w:hAnsi="Open Sans" w:cs="Open Sans"/>
-                <w:b/>
                 <w:bCs/>
                 <w:color w:val="FFFFFF"/>
                 <w:sz w:val="18"/>
                 <w:szCs w:val="18"/>
               </w:rPr>
-              <w:t xml:space="preserve">Sees</w:t>
+              <w:t>Sees</w:t>
             </w:r>
           </w:p>
         </w:tc>
@@ -4950,13 +4906,12 @@
             <w:r>
               <w:rPr>
                 <w:rFonts w:ascii="Open Sans" w:hAnsi="Open Sans" w:cs="Open Sans"/>
-                <w:b/>
                 <w:bCs/>
                 <w:color w:val="FFFFFF"/>
                 <w:sz w:val="18"/>
                 <w:szCs w:val="18"/>
               </w:rPr>
-              <w:t xml:space="preserve">Never sees</w:t>
+              <w:t>Never sees</w:t>
             </w:r>
           </w:p>
         </w:tc>
@@ -4972,13 +4927,12 @@
             <w:r>
               <w:rPr>
                 <w:rFonts w:ascii="Open Sans" w:hAnsi="Open Sans" w:cs="Open Sans"/>
-                <w:b/>
                 <w:bCs/>
                 <w:color w:val="FFFFFF"/>
                 <w:sz w:val="18"/>
                 <w:szCs w:val="18"/>
               </w:rPr>
-              <w:t xml:space="preserve">Produces</w:t>
+              <w:t>Produces</w:t>
             </w:r>
           </w:p>
         </w:tc>
@@ -5003,7 +4957,7 @@
                 <w:sz w:val="18"/>
                 <w:szCs w:val="18"/>
               </w:rPr>
-              <w:t xml:space="preserve">Thought Generator</w:t>
+              <w:t>Thought Generator</w:t>
             </w:r>
           </w:p>
         </w:tc>
@@ -5023,7 +4977,7 @@
                 <w:sz w:val="18"/>
                 <w:szCs w:val="18"/>
               </w:rPr>
-              <w:t xml:space="preserve">Propose 3 distinct readings, then 3 claim sets for each reading kept</w:t>
+              <w:t>Propose 3 distinct readings, then 3 claim sets for each reading kept</w:t>
             </w:r>
           </w:p>
         </w:tc>
@@ -5043,7 +4997,7 @@
                 <w:sz w:val="18"/>
                 <w:szCs w:val="18"/>
               </w:rPr>
-              <w:t xml:space="preserve">Thesis, ticker, clarifying answers, the investor’s past claim edits</w:t>
+              <w:t>Thesis, ticker, clarifying answers, the investor’s past claim edits</w:t>
             </w:r>
           </w:p>
         </w:tc>
@@ -5063,7 +5017,7 @@
                 <w:sz w:val="18"/>
                 <w:szCs w:val="18"/>
               </w:rPr>
-              <w:t xml:space="preserve">Scores, data values</w:t>
+              <w:t>Scores, data values</w:t>
             </w:r>
           </w:p>
         </w:tc>
@@ -5083,7 +5037,7 @@
                 <w:sz w:val="18"/>
                 <w:szCs w:val="18"/>
               </w:rPr>
-              <w:t xml:space="preserve">Readings and claim sets in a fixed Pydantic schema</w:t>
+              <w:t>Readings and claim sets in a fixed Pydantic schema</w:t>
             </w:r>
           </w:p>
         </w:tc>
@@ -5109,7 +5063,7 @@
                 <w:sz w:val="18"/>
                 <w:szCs w:val="18"/>
               </w:rPr>
-              <w:t xml:space="preserve">Claim Critic</w:t>
+              <w:t>Claim Critic</w:t>
             </w:r>
           </w:p>
         </w:tc>
@@ -5130,7 +5084,7 @@
                 <w:sz w:val="18"/>
                 <w:szCs w:val="18"/>
               </w:rPr>
-              <w:t xml:space="preserve">Score one candidate against the rubric</w:t>
+              <w:t>Score one candidate against the rubric</w:t>
             </w:r>
           </w:p>
         </w:tc>
@@ -5151,7 +5105,7 @@
                 <w:sz w:val="18"/>
                 <w:szCs w:val="18"/>
               </w:rPr>
-              <w:t xml:space="preserve">Thesis, one candidate, its gate results (found / not found)</w:t>
+              <w:t>Thesis, one candidate, its gate results (found / not found)</w:t>
             </w:r>
           </w:p>
         </w:tc>
@@ -5172,7 +5126,7 @@
                 <w:sz w:val="18"/>
                 <w:szCs w:val="18"/>
               </w:rPr>
-              <w:t xml:space="preserve">Other candidates, the generator’s reasoning, the investor’s edits, data values</w:t>
+              <w:t>Other candidates, the generator’s reasoning, the investor’s edits, data values</w:t>
             </w:r>
           </w:p>
         </w:tc>
@@ -5193,7 +5147,7 @@
                 <w:sz w:val="18"/>
                 <w:szCs w:val="18"/>
               </w:rPr>
-              <w:t xml:space="preserve">A 1–5 score per criterion, each with a one-line reason</w:t>
+              <w:t>A 1–5 score per criterion, each with a one-line reason</w:t>
             </w:r>
           </w:p>
         </w:tc>
@@ -5218,7 +5172,7 @@
                 <w:sz w:val="18"/>
                 <w:szCs w:val="18"/>
               </w:rPr>
-              <w:t xml:space="preserve">Decision maker</w:t>
+              <w:t>Decision maker</w:t>
             </w:r>
           </w:p>
         </w:tc>
@@ -5238,7 +5192,7 @@
                 <w:sz w:val="18"/>
                 <w:szCs w:val="18"/>
               </w:rPr>
-              <w:t xml:space="preserve">Apply the gate results and score thresholds, prune, run the beam, tie and budget rules, and stop</w:t>
+              <w:t>Apply the gate results and score thresholds, prune, run the beam, tie and budget rules, and stop</w:t>
             </w:r>
           </w:p>
         </w:tc>
@@ -5258,7 +5212,7 @@
                 <w:sz w:val="18"/>
                 <w:szCs w:val="18"/>
               </w:rPr>
-              <w:t xml:space="preserve">The whole tree and the budget counters</w:t>
+              <w:t>The whole tree and the budget counters</w:t>
             </w:r>
           </w:p>
         </w:tc>
@@ -5278,7 +5232,7 @@
                 <w:sz w:val="18"/>
                 <w:szCs w:val="18"/>
               </w:rPr>
-              <w:t xml:space="preserve">n/a (deterministic code)</w:t>
+              <w:t>n/a (deterministic code)</w:t>
             </w:r>
           </w:p>
         </w:tc>
@@ -5298,7 +5252,7 @@
                 <w:sz w:val="18"/>
                 <w:szCs w:val="18"/>
               </w:rPr>
-              <w:t xml:space="preserve">The selected claim set, or two when tied</w:t>
+              <w:t>The selected claim set, or two when tied</w:t>
             </w:r>
           </w:p>
         </w:tc>
@@ -5324,7 +5278,7 @@
                 <w:sz w:val="18"/>
                 <w:szCs w:val="18"/>
               </w:rPr>
-              <w:t xml:space="preserve">State manager</w:t>
+              <w:t>State manager</w:t>
             </w:r>
           </w:p>
         </w:tc>
@@ -5345,7 +5299,7 @@
                 <w:sz w:val="18"/>
                 <w:szCs w:val="18"/>
               </w:rPr>
-              <w:t xml:space="preserve">Keep the tree consistent and resumable, and save the result</w:t>
+              <w:t>Keep the tree consistent and resumable, and save the result</w:t>
             </w:r>
           </w:p>
         </w:tc>
@@ -5366,7 +5320,7 @@
                 <w:sz w:val="18"/>
                 <w:szCs w:val="18"/>
               </w:rPr>
-              <w:t xml:space="preserve">Every node</w:t>
+              <w:t>Every node</w:t>
             </w:r>
           </w:p>
         </w:tc>
@@ -5387,7 +5341,7 @@
                 <w:sz w:val="18"/>
                 <w:szCs w:val="18"/>
               </w:rPr>
-              <w:t xml:space="preserve">n/a (storage)</w:t>
+              <w:t>n/a (storage)</w:t>
             </w:r>
           </w:p>
         </w:tc>
@@ -5408,7 +5362,7 @@
                 <w:sz w:val="18"/>
                 <w:szCs w:val="18"/>
               </w:rPr>
-              <w:t xml:space="preserve">A checkpoint per level, the run log, and confirmed claims in long-term memory</w:t>
+              <w:t>A checkpoint per level, the run log, and confirmed claims in long-term memory</w:t>
             </w:r>
           </w:p>
         </w:tc>
@@ -5426,13 +5380,12 @@
       <w:r>
         <w:rPr>
           <w:rFonts w:ascii="Open Sans" w:hAnsi="Open Sans" w:cs="Open Sans"/>
-          <w:b/>
           <w:bCs/>
           <w:color w:val="000000"/>
           <w:sz w:val="21"/>
           <w:szCs w:val="21"/>
         </w:rPr>
-        <w:t xml:space="preserve">How each tool supports each role.</w:t>
+        <w:t>How each tool supports each role.</w:t>
       </w:r>
     </w:p>
     <w:tbl>
@@ -5478,13 +5431,12 @@
             <w:r>
               <w:rPr>
                 <w:rFonts w:ascii="Open Sans" w:hAnsi="Open Sans" w:cs="Open Sans"/>
-                <w:b/>
                 <w:bCs/>
                 <w:color w:val="FFFFFF"/>
                 <w:sz w:val="18"/>
                 <w:szCs w:val="18"/>
               </w:rPr>
-              <w:t xml:space="preserve">ToT role</w:t>
+              <w:t>ToT role</w:t>
             </w:r>
           </w:p>
         </w:tc>
@@ -5500,13 +5452,12 @@
             <w:r>
               <w:rPr>
                 <w:rFonts w:ascii="Open Sans" w:hAnsi="Open Sans" w:cs="Open Sans"/>
-                <w:b/>
                 <w:bCs/>
                 <w:color w:val="FFFFFF"/>
                 <w:sz w:val="18"/>
                 <w:szCs w:val="18"/>
               </w:rPr>
-              <w:t xml:space="preserve">LangChain / LangGraph</w:t>
+              <w:t>LangChain / LangGraph</w:t>
             </w:r>
           </w:p>
         </w:tc>
@@ -5522,13 +5473,12 @@
             <w:r>
               <w:rPr>
                 <w:rFonts w:ascii="Open Sans" w:hAnsi="Open Sans" w:cs="Open Sans"/>
-                <w:b/>
                 <w:bCs/>
                 <w:color w:val="FFFFFF"/>
                 <w:sz w:val="18"/>
                 <w:szCs w:val="18"/>
               </w:rPr>
-              <w:t xml:space="preserve">MCP</w:t>
+              <w:t>MCP</w:t>
             </w:r>
           </w:p>
         </w:tc>
@@ -5544,13 +5494,12 @@
             <w:r>
               <w:rPr>
                 <w:rFonts w:ascii="Open Sans" w:hAnsi="Open Sans" w:cs="Open Sans"/>
-                <w:b/>
                 <w:bCs/>
                 <w:color w:val="FFFFFF"/>
                 <w:sz w:val="18"/>
                 <w:szCs w:val="18"/>
               </w:rPr>
-              <w:t xml:space="preserve">CrewAI (evaluated)</w:t>
+              <w:t>CrewAI (evaluated)</w:t>
             </w:r>
           </w:p>
         </w:tc>
@@ -5575,7 +5524,7 @@
                 <w:sz w:val="18"/>
                 <w:szCs w:val="18"/>
               </w:rPr>
-              <w:t xml:space="preserve">Thought Generator</w:t>
+              <w:t>Thought Generator</w:t>
             </w:r>
           </w:p>
         </w:tc>
@@ -5590,13 +5539,12 @@
             <w:r>
               <w:rPr>
                 <w:rFonts w:ascii="Open Sans" w:hAnsi="Open Sans" w:cs="Open Sans"/>
-                <w:b/>
                 <w:bCs/>
                 <w:color w:val="000000"/>
                 <w:sz w:val="18"/>
                 <w:szCs w:val="18"/>
               </w:rPr>
-              <w:t xml:space="preserve">Used.</w:t>
+              <w:t>Used.</w:t>
             </w:r>
             <w:r>
               <w:rPr>
@@ -5616,7 +5564,7 @@
                 <w:sz w:val="16"/>
                 <w:szCs w:val="16"/>
               </w:rPr>
-              <w:t xml:space="preserve">batch()</w:t>
+              <w:t>batch()</w:t>
             </w:r>
             <w:r>
               <w:rPr>
@@ -5641,13 +5589,12 @@
             <w:r>
               <w:rPr>
                 <w:rFonts w:ascii="Open Sans" w:hAnsi="Open Sans" w:cs="Open Sans"/>
-                <w:b/>
                 <w:bCs/>
                 <w:color w:val="000000"/>
                 <w:sz w:val="18"/>
                 <w:szCs w:val="18"/>
               </w:rPr>
-              <w:t xml:space="preserve">Used</w:t>
+              <w:t>Used</w:t>
             </w:r>
             <w:r>
               <w:rPr>
@@ -5687,7 +5634,7 @@
                 <w:sz w:val="16"/>
                 <w:szCs w:val="16"/>
               </w:rPr>
-              <w:t xml:space="preserve">Agent</w:t>
+              <w:t>Agent</w:t>
             </w:r>
             <w:r>
               <w:rPr>
@@ -5723,7 +5670,7 @@
                 <w:sz w:val="18"/>
                 <w:szCs w:val="18"/>
               </w:rPr>
-              <w:t xml:space="preserve">Critic / evaluator (gates + Claim Critic)</w:t>
+              <w:t>Critic / evaluator (gates + Claim Critic)</w:t>
             </w:r>
           </w:p>
         </w:tc>
@@ -5739,13 +5686,12 @@
             <w:r>
               <w:rPr>
                 <w:rFonts w:ascii="Open Sans" w:hAnsi="Open Sans" w:cs="Open Sans"/>
-                <w:b/>
                 <w:bCs/>
                 <w:color w:val="000000"/>
                 <w:sz w:val="18"/>
                 <w:szCs w:val="18"/>
               </w:rPr>
-              <w:t xml:space="preserve">Used.</w:t>
+              <w:t>Used.</w:t>
             </w:r>
             <w:r>
               <w:rPr>
@@ -5771,13 +5717,12 @@
             <w:r>
               <w:rPr>
                 <w:rFonts w:ascii="Open Sans" w:hAnsi="Open Sans" w:cs="Open Sans"/>
-                <w:b/>
                 <w:bCs/>
                 <w:color w:val="000000"/>
                 <w:sz w:val="18"/>
                 <w:szCs w:val="18"/>
               </w:rPr>
-              <w:t xml:space="preserve">Used</w:t>
+              <w:t>Used</w:t>
             </w:r>
             <w:r>
               <w:rPr>
@@ -5797,7 +5742,7 @@
                 <w:sz w:val="16"/>
                 <w:szCs w:val="16"/>
               </w:rPr>
-              <w:t xml:space="preserve">search_filings</w:t>
+              <w:t>search_filings</w:t>
             </w:r>
             <w:r>
               <w:rPr>
@@ -5838,17 +5783,17 @@
                 <w:sz w:val="16"/>
                 <w:szCs w:val="16"/>
               </w:rPr>
-              <w:t xml:space="preserve">Agent</w:t>
-            </w:r>
-            <w:r>
-              <w:rPr>
-                <w:rFonts w:ascii="Open Sans" w:hAnsi="Open Sans" w:cs="Open Sans"/>
-                <w:b w:val="0"/>
-                <w:color w:val="000000"/>
-                <w:sz w:val="18"/>
-                <w:szCs w:val="18"/>
-              </w:rPr>
-              <w:t xml:space="preserve">. Not needed, for the same reason. CrewAI’s built-in crew memory is shared between agents, which would undo the critic’s isolation</w:t>
+              <w:t>Agent</w:t>
+            </w:r>
+            <w:r>
+              <w:rPr>
+                <w:rFonts w:ascii="Open Sans" w:hAnsi="Open Sans" w:cs="Open Sans"/>
+                <w:b w:val="0"/>
+                <w:color w:val="000000"/>
+                <w:sz w:val="18"/>
+                <w:szCs w:val="18"/>
+              </w:rPr>
+              <w:t>. Not needed, for the same reason. CrewAI’s built-in crew memory is shared between agents, which would undo the critic’s isolation</w:t>
             </w:r>
           </w:p>
         </w:tc>
@@ -5873,7 +5818,8 @@
                 <w:sz w:val="18"/>
                 <w:szCs w:val="18"/>
               </w:rPr>
-              <w:t xml:space="preserve">Decision maker</w:t>
+              <w:lastRenderedPageBreak/>
+              <w:t>Decision maker</w:t>
             </w:r>
           </w:p>
         </w:tc>
@@ -5888,13 +5834,12 @@
             <w:r>
               <w:rPr>
                 <w:rFonts w:ascii="Open Sans" w:hAnsi="Open Sans" w:cs="Open Sans"/>
-                <w:b/>
                 <w:bCs/>
                 <w:color w:val="000000"/>
                 <w:sz w:val="18"/>
                 <w:szCs w:val="18"/>
               </w:rPr>
-              <w:t xml:space="preserve">Used.</w:t>
+              <w:t>Used.</w:t>
             </w:r>
             <w:r>
               <w:rPr>
@@ -5924,7 +5869,7 @@
                 <w:sz w:val="18"/>
                 <w:szCs w:val="18"/>
               </w:rPr>
-              <w:t xml:space="preserve">Not used</w:t>
+              <w:t>Not used</w:t>
             </w:r>
           </w:p>
         </w:tc>
@@ -5944,7 +5889,7 @@
                 <w:sz w:val="18"/>
                 <w:szCs w:val="18"/>
               </w:rPr>
-              <w:t xml:space="preserve">Not suitable: CrewAI’s hierarchical process lets a manager LLM choose the next step, which the fixed Supervisor design rules out</w:t>
+              <w:t>Not suitable: CrewAI’s hierarchical process lets a manager LLM choose the next step, which the fixed Supervisor design rules out</w:t>
             </w:r>
           </w:p>
         </w:tc>
@@ -5970,7 +5915,7 @@
                 <w:sz w:val="18"/>
                 <w:szCs w:val="18"/>
               </w:rPr>
-              <w:t xml:space="preserve">State manager</w:t>
+              <w:t>State manager</w:t>
             </w:r>
           </w:p>
         </w:tc>
@@ -5986,13 +5931,12 @@
             <w:r>
               <w:rPr>
                 <w:rFonts w:ascii="Open Sans" w:hAnsi="Open Sans" w:cs="Open Sans"/>
-                <w:b/>
                 <w:bCs/>
                 <w:color w:val="000000"/>
                 <w:sz w:val="18"/>
                 <w:szCs w:val="18"/>
               </w:rPr>
-              <w:t xml:space="preserve">Used.</w:t>
+              <w:t>Used.</w:t>
             </w:r>
             <w:r>
               <w:rPr>
@@ -6018,13 +5962,12 @@
             <w:r>
               <w:rPr>
                 <w:rFonts w:ascii="Open Sans" w:hAnsi="Open Sans" w:cs="Open Sans"/>
-                <w:b/>
                 <w:bCs/>
                 <w:color w:val="000000"/>
                 <w:sz w:val="18"/>
                 <w:szCs w:val="18"/>
               </w:rPr>
-              <w:t xml:space="preserve">Used</w:t>
+              <w:t>Used</w:t>
             </w:r>
             <w:r>
               <w:rPr>
@@ -6055,7 +5998,7 @@
                 <w:sz w:val="18"/>
                 <w:szCs w:val="18"/>
               </w:rPr>
-              <w:t xml:space="preserve">Not used: its own memory and task outputs would be a second copy of the state</w:t>
+              <w:t>Not used: its own memory and task outputs would be a second copy of the state</w:t>
             </w:r>
           </w:p>
         </w:tc>
@@ -6078,7 +6021,7 @@
           <w:sz w:val="21"/>
           <w:szCs w:val="21"/>
         </w:rPr>
-        <w:t xml:space="preserve">The tree itself stays in LangGraph, because the decision maker reads and writes it at every step. MCP carries what is shared beyond this step: the SEC tools and the thesis store. Only the chosen claim set passes to the downstream agents; the full tree goes to the run log.</w:t>
+        <w:t>The tree itself stays in LangGraph, because the decision maker reads and writes it at every step. MCP carries what is shared beyond this step: the SEC tools and the thesis store. Only the chosen claim set passes to the downstream agents; the full tree goes to the run log.</w:t>
       </w:r>
     </w:p>
     <w:p>
@@ -6088,13 +6031,12 @@
       <w:r>
         <w:rPr>
           <w:rFonts w:ascii="Open Sans" w:hAnsi="Open Sans" w:cs="Open Sans"/>
-          <w:b/>
           <w:bCs/>
           <w:color w:val="000000"/>
           <w:sz w:val="21"/>
           <w:szCs w:val="21"/>
         </w:rPr>
-        <w:t xml:space="preserve">Why LangChain is enough, and CrewAI isn’t used.</w:t>
+        <w:t>Why LangChain is enough, and CrewAI isn’t used.</w:t>
       </w:r>
       <w:r>
         <w:rPr>
@@ -6118,13 +6060,12 @@
       <w:r>
         <w:rPr>
           <w:rFonts w:ascii="Open Sans" w:hAnsi="Open Sans" w:cs="Open Sans"/>
-          <w:b/>
           <w:bCs/>
           <w:color w:val="A6192E"/>
           <w:sz w:val="25"/>
           <w:szCs w:val="25"/>
         </w:rPr>
-        <w:t xml:space="preserve">7. Risk and mitigation</w:t>
+        <w:t>7. Risk and mitigation</w:t>
       </w:r>
     </w:p>
     <w:p>
@@ -6134,13 +6075,12 @@
       <w:r>
         <w:rPr>
           <w:rFonts w:ascii="Open Sans" w:hAnsi="Open Sans" w:cs="Open Sans"/>
-          <w:b/>
           <w:bCs/>
           <w:color w:val="000000"/>
           <w:sz w:val="21"/>
           <w:szCs w:val="21"/>
         </w:rPr>
-        <w:t xml:space="preserve">Risk: weak evaluation signals cause premature pruning of the best branch.</w:t>
+        <w:t>Risk: weak evaluation signals cause premature pruning of the best branch.</w:t>
       </w:r>
       <w:r>
         <w:rPr>
@@ -6160,13 +6100,12 @@
       <w:r>
         <w:rPr>
           <w:rFonts w:ascii="Open Sans" w:hAnsi="Open Sans" w:cs="Open Sans"/>
-          <w:b/>
           <w:bCs/>
           <w:color w:val="000000"/>
           <w:sz w:val="21"/>
           <w:szCs w:val="21"/>
         </w:rPr>
-        <w:t xml:space="preserve">Mitigation: the critic ranks but doesn’t cut alone, and it is calibrated before it’s trusted.</w:t>
+        <w:t>Mitigation: the critic ranks but doesn’t cut alone, and it is calibrated before it’s trusted.</w:t>
       </w:r>
     </w:p>
     <w:p>
@@ -6185,7 +6124,7 @@
           <w:sz w:val="21"/>
           <w:szCs w:val="21"/>
         </w:rPr>
-        <w:t xml:space="preserve">Outright cuts come from objective checks: the gates, and clear misreadings (Faithful &lt; 3). Otherwise the critic’s score only orders branches. The beam keeps two readings, so one misjudgment doesn’t decide the outcome, and near-ties go to the investor.</w:t>
+        <w:t>Outright cuts come from objective checks: the gates, and clear misreadings (Faithful &lt; 3). Otherwise the critic’s score only orders branches. The beam keeps two readings, so one misjudgment doesn’t decide the outcome, and near-ties go to the investor.</w:t>
       </w:r>
     </w:p>
     <w:p>
@@ -6204,7 +6143,8 @@
           <w:sz w:val="21"/>
           <w:szCs w:val="21"/>
         </w:rPr>
-        <w:t xml:space="preserve">The golden set gains about 20 theses with my reference readings and claim sets. Before ToT goes live, I’ll measure how often the reference reading survives depth 1 (target: at least 90%). If it falls short, I’ll adjust the rubric anchors, the 3.5 threshold or the beam width.</w:t>
+        <w:lastRenderedPageBreak/>
+        <w:t>The golden set gains about 20 theses with my reference readings and claim sets. Before ToT goes live, I’ll measure how often the reference reading survives depth 1 (target: at least 90%). If it falls short, I’ll adjust the rubric anchors, the 3.5 threshold or the beam width.</w:t>
       </w:r>
     </w:p>
     <w:p>
@@ -6223,7 +6163,7 @@
           <w:sz w:val="21"/>
           <w:szCs w:val="21"/>
         </w:rPr>
-        <w:t xml:space="preserve">Every pruned branch is logged with its score and reason, so a wrong cut shows up in the run log instead of passing silently.</w:t>
+        <w:t>Every pruned branch is logged with its score and reason, so a wrong cut shows up in the run log instead of passing silently.</w:t>
       </w:r>
     </w:p>
     <w:p>
@@ -6238,7 +6178,7 @@
           <w:sz w:val="21"/>
           <w:szCs w:val="21"/>
         </w:rPr>
-        <w:t xml:space="preserve">The design also handles the other common ToT risks: the fixed beam and call caps prevent branch explosion, and immutable nodes keep branch state consistent.</w:t>
+        <w:t>The design also handles the other common ToT risks: the fixed beam and call caps prevent branch explosion, and immutable nodes keep branch state consistent.</w:t>
       </w:r>
     </w:p>
     <w:p>
@@ -6252,13 +6192,12 @@
       <w:r>
         <w:rPr>
           <w:rFonts w:ascii="Open Sans" w:hAnsi="Open Sans" w:cs="Open Sans"/>
-          <w:b/>
           <w:bCs/>
           <w:color w:val="A6192E"/>
           <w:sz w:val="25"/>
           <w:szCs w:val="25"/>
         </w:rPr>
-        <w:t xml:space="preserve">8. What changes from Checkpoints 2.1 and 3.1</w:t>
+        <w:t>8. What changes from Checkpoints 2.1 and 3.1</w:t>
       </w:r>
     </w:p>
     <w:p>
@@ -6272,13 +6211,12 @@
       <w:r>
         <w:rPr>
           <w:rFonts w:ascii="Open Sans" w:hAnsi="Open Sans" w:cs="Open Sans"/>
-          <w:b/>
           <w:bCs/>
           <w:color w:val="000000"/>
           <w:sz w:val="21"/>
           <w:szCs w:val="21"/>
         </w:rPr>
-        <w:t xml:space="preserve">Thesis Analyst:</w:t>
+        <w:t>Thesis Analyst:</w:t>
       </w:r>
       <w:r>
         <w:rPr>
@@ -6302,13 +6240,12 @@
       <w:r>
         <w:rPr>
           <w:rFonts w:ascii="Open Sans" w:hAnsi="Open Sans" w:cs="Open Sans"/>
-          <w:b/>
           <w:bCs/>
           <w:color w:val="000000"/>
           <w:sz w:val="21"/>
           <w:szCs w:val="21"/>
         </w:rPr>
-        <w:t xml:space="preserve">System design:</w:t>
+        <w:t>System design:</w:t>
       </w:r>
       <w:r>
         <w:rPr>
@@ -6332,13 +6269,12 @@
       <w:r>
         <w:rPr>
           <w:rFonts w:ascii="Open Sans" w:hAnsi="Open Sans" w:cs="Open Sans"/>
-          <w:b/>
           <w:bCs/>
           <w:color w:val="000000"/>
           <w:sz w:val="21"/>
           <w:szCs w:val="21"/>
         </w:rPr>
-        <w:t xml:space="preserve">Claim confirmation:</w:t>
+        <w:t>Claim confirmation:</w:t>
       </w:r>
       <w:r>
         <w:rPr>
@@ -6362,13 +6298,12 @@
       <w:r>
         <w:rPr>
           <w:rFonts w:ascii="Open Sans" w:hAnsi="Open Sans" w:cs="Open Sans"/>
-          <w:b/>
           <w:bCs/>
           <w:color w:val="000000"/>
           <w:sz w:val="21"/>
           <w:szCs w:val="21"/>
         </w:rPr>
-        <w:t xml:space="preserve">“Untestable as stated”</w:t>
+        <w:t>“Untestable as stated”</w:t>
       </w:r>
       <w:r>
         <w:rPr>
@@ -6392,13 +6327,12 @@
       <w:r>
         <w:rPr>
           <w:rFonts w:ascii="Open Sans" w:hAnsi="Open Sans" w:cs="Open Sans"/>
-          <w:b/>
           <w:bCs/>
           <w:color w:val="000000"/>
           <w:sz w:val="21"/>
           <w:szCs w:val="21"/>
         </w:rPr>
-        <w:t xml:space="preserve">Ingest timing:</w:t>
+        <w:t>Ingest timing:</w:t>
       </w:r>
       <w:r>
         <w:rPr>
@@ -6422,13 +6356,12 @@
       <w:r>
         <w:rPr>
           <w:rFonts w:ascii="Open Sans" w:hAnsi="Open Sans" w:cs="Open Sans"/>
-          <w:b/>
           <w:bCs/>
           <w:color w:val="000000"/>
           <w:sz w:val="21"/>
           <w:szCs w:val="21"/>
         </w:rPr>
-        <w:t xml:space="preserve">Run log and golden set:</w:t>
+        <w:t>Run log and golden set:</w:t>
       </w:r>
       <w:r>
         <w:rPr>
@@ -6452,13 +6385,12 @@
       <w:r>
         <w:rPr>
           <w:rFonts w:ascii="Open Sans" w:hAnsi="Open Sans" w:cs="Open Sans"/>
-          <w:b/>
           <w:bCs/>
           <w:color w:val="000000"/>
           <w:sz w:val="21"/>
           <w:szCs w:val="21"/>
         </w:rPr>
-        <w:t xml:space="preserve">Evaluation:</w:t>
+        <w:t>Evaluation:</w:t>
       </w:r>
       <w:r>
         <w:rPr>
@@ -6482,13 +6414,12 @@
       <w:r>
         <w:rPr>
           <w:rFonts w:ascii="Open Sans" w:hAnsi="Open Sans" w:cs="Open Sans"/>
-          <w:b/>
           <w:bCs/>
           <w:color w:val="000000"/>
           <w:sz w:val="21"/>
           <w:szCs w:val="21"/>
         </w:rPr>
-        <w:t xml:space="preserve">Provisional values:</w:t>
+        <w:t>Provisional values:</w:t>
       </w:r>
       <w:r>
         <w:rPr>
@@ -6512,13 +6443,12 @@
       <w:r>
         <w:rPr>
           <w:rFonts w:ascii="Open Sans" w:hAnsi="Open Sans" w:cs="Open Sans"/>
-          <w:b/>
           <w:bCs/>
           <w:color w:val="A6192E"/>
           <w:sz w:val="25"/>
           <w:szCs w:val="25"/>
         </w:rPr>
-        <w:t xml:space="preserve">9. Project repository</w:t>
+        <w:t>9. Project repository</w:t>
       </w:r>
     </w:p>
     <w:p>
@@ -6535,7 +6465,7 @@
         </w:rPr>
         <w:t xml:space="preserve">Repository: </w:t>
       </w:r>
-      <w:hyperlink r:id="rId201" w:history="1">
+      <w:hyperlink r:id="rId13" w:history="1">
         <w:r>
           <w:rPr>
             <w:rStyle w:val="Hyperlink"/>
@@ -6544,7 +6474,7 @@
             <w:sz w:val="21"/>
             <w:szCs w:val="21"/>
           </w:rPr>
-          <w:t xml:space="preserve">https://github.com/mosachde/agentic-ai-real-world-capstone-work</w:t>
+          <w:t>https://github.com/mosachde/agentic-ai-real-world-capstone-work</w:t>
         </w:r>
       </w:hyperlink>
     </w:p>
@@ -6562,7 +6492,7 @@
         </w:rPr>
         <w:t xml:space="preserve">This checkpoint: </w:t>
       </w:r>
-      <w:hyperlink r:id="rId202" w:history="1">
+      <w:hyperlink r:id="rId14" w:history="1">
         <w:r>
           <w:rPr>
             <w:rStyle w:val="Hyperlink"/>
@@ -6571,7 +6501,7 @@
             <w:sz w:val="21"/>
             <w:szCs w:val="21"/>
           </w:rPr>
-          <w:t xml:space="preserve">https://github.com/mosachde/agentic-ai-real-world-capstone-work/tree/checkpoint-4.1/docs</w:t>
+          <w:t>https://github.com/mosachde/agentic-ai-real-world-capstone-work/tree/checkpoint-4.1/docs</w:t>
         </w:r>
       </w:hyperlink>
     </w:p>
@@ -6579,36 +6509,6 @@
       <w:pPr>
         <w:spacing w:after="120" w:line="276" w:lineRule="auto"/>
       </w:pPr>
-      <w:r>
-        <w:rPr>
-          <w:rFonts w:ascii="Open Sans" w:hAnsi="Open Sans" w:cs="Open Sans"/>
-          <w:b w:val="0"/>
-          <w:color w:val="000000"/>
-          <w:sz w:val="21"/>
-          <w:szCs w:val="21"/>
-        </w:rPr>
-        <w:t xml:space="preserve">Next build step: the EDGAR ingest pipeline and the </w:t>
-      </w:r>
-      <w:r>
-        <w:rPr>
-          <w:rFonts w:ascii="Consolas" w:hAnsi="Consolas" w:cs="Consolas"/>
-          <w:b w:val="0"/>
-          <w:color w:val="000000"/>
-          <w:sz w:val="19"/>
-          <w:szCs w:val="19"/>
-        </w:rPr>
-        <w:t xml:space="preserve">search_filings</w:t>
-      </w:r>
-      <w:r>
-        <w:rPr>
-          <w:rFonts w:ascii="Open Sans" w:hAnsi="Open Sans" w:cs="Open Sans"/>
-          <w:b w:val="0"/>
-          <w:color w:val="000000"/>
-          <w:sz w:val="21"/>
-          <w:szCs w:val="21"/>
-        </w:rPr>
-        <w:t xml:space="preserve"> tool, which the ToT testability probes also depend on.</w:t>
-      </w:r>
     </w:p>
     <w:sectPr>
       <w:headerReference w:type="default" r:id="rId15"/>
@@ -8166,7 +8066,7 @@
         <w:sz w:val="20"/>
       </w:rPr>
     </w:lvl>
-    <w:lvl w:ilvl="1" w:tentative="1">
+    <w:lvl w:ilvl="1">
       <w:start w:val="1"/>
       <w:numFmt w:val="bullet"/>
       <w:lvlText w:val="o"/>
@@ -10210,6 +10110,10 @@
 </file>
 
 <file path=customXml/item1.xml><?xml version="1.0" encoding="utf-8"?>
+<b:Sources xmlns:b="http://schemas.openxmlformats.org/officeDocument/2006/bibliography" xmlns="http://schemas.openxmlformats.org/officeDocument/2006/bibliography" SelectedStyle="\APASixthEditionOfficeOnline.xsl" StyleName="APA" Version="6"/>
+</file>
+
+<file path=customXml/item2.xml><?xml version="1.0" encoding="utf-8"?>
 <ct:contentTypeSchema xmlns:ct="http://schemas.microsoft.com/office/2006/metadata/contentType" xmlns:ma="http://schemas.microsoft.com/office/2006/metadata/properties/metaAttributes" ct:_="" ma:_="" ma:contentTypeName="Document" ma:contentTypeID="0x010100BC67928A359D264F9EF1880C2E221F2D" ma:contentTypeVersion="11" ma:contentTypeDescription="Create a new document." ma:contentTypeScope="" ma:versionID="c3622a102496d83dcbf86952a1135697">
   <xsd:schema xmlns:xsd="http://www.w3.org/2001/XMLSchema" xmlns:xs="http://www.w3.org/2001/XMLSchema" xmlns:p="http://schemas.microsoft.com/office/2006/metadata/properties" xmlns:ns2="b950caa2-3060-400e-ac69-190ee22b5a3c" xmlns:ns3="aa9de4af-3fdf-4657-9a9d-58b7532d65ed" targetNamespace="http://schemas.microsoft.com/office/2006/metadata/properties" ma:root="true" ma:fieldsID="b97c1b2c168b90592a44eaed7a31b998" ns2:_="" ns3:_="">
     <xsd:import namespace="b950caa2-3060-400e-ac69-190ee22b5a3c"/>
@@ -10404,17 +10308,10 @@
 </ct:contentTypeSchema>
 </file>
 
-<file path=customXml/item2.xml><?xml version="1.0" encoding="utf-8"?>
-<b:Sources xmlns:b="http://schemas.openxmlformats.org/officeDocument/2006/bibliography" xmlns="http://schemas.openxmlformats.org/officeDocument/2006/bibliography" SelectedStyle="\APASixthEditionOfficeOnline.xsl" StyleName="APA" Version="6"/>
-</file>
-
 <file path=customXml/item3.xml><?xml version="1.0" encoding="utf-8"?>
-<?mso-contentType ?>
-<FormTemplates xmlns="http://schemas.microsoft.com/sharepoint/v3/contenttype/forms">
-  <Display>DocumentLibraryForm</Display>
-  <Edit>DocumentLibraryForm</Edit>
-  <New>DocumentLibraryForm</New>
-</FormTemplates>
+<go:gDocsCustomXmlDataStorage xmlns:go="http://customooxmlschemas.google.com/" xmlns:r="http://schemas.openxmlformats.org/officeDocument/2006/relationships">
+  <go:docsCustomData xmlns:go="http://customooxmlschemas.google.com/" roundtripDataSignature="AMtx7mipwmvtScRWrTBXm/U1U4IL8/yT+Q==">AMUW2mUo3hs247llBQCCeIDyw/o6c4OsjQII5teSoi43v/barLRmXDTC1CnGRzyBBJBKXLTUgrf3Q76HNtJ+zdOE8iULy8k79jUPrIuPxOm7e3PYoIxsqb0=</go:docsCustomData>
+</go:gDocsCustomXmlDataStorage>
 </file>
 
 <file path=customXml/item4.xml><?xml version="1.0" encoding="utf-8"?>
@@ -10429,12 +10326,23 @@
 </file>
 
 <file path=customXml/item5.xml><?xml version="1.0" encoding="utf-8"?>
-<go:gDocsCustomXmlDataStorage xmlns:go="http://customooxmlschemas.google.com/" xmlns:r="http://schemas.openxmlformats.org/officeDocument/2006/relationships">
-  <go:docsCustomData xmlns:go="http://customooxmlschemas.google.com/" roundtripDataSignature="AMtx7mipwmvtScRWrTBXm/U1U4IL8/yT+Q==">AMUW2mUo3hs247llBQCCeIDyw/o6c4OsjQII5teSoi43v/barLRmXDTC1CnGRzyBBJBKXLTUgrf3Q76HNtJ+zdOE8iULy8k79jUPrIuPxOm7e3PYoIxsqb0=</go:docsCustomData>
-</go:gDocsCustomXmlDataStorage>
+<?mso-contentType ?>
+<FormTemplates xmlns="http://schemas.microsoft.com/sharepoint/v3/contenttype/forms">
+  <Display>DocumentLibraryForm</Display>
+  <Edit>DocumentLibraryForm</Edit>
+  <New>DocumentLibraryForm</New>
+</FormTemplates>
 </file>
 
 <file path=customXml/itemProps1.xml><?xml version="1.0" encoding="utf-8"?>
+<ds:datastoreItem xmlns:ds="http://schemas.openxmlformats.org/officeDocument/2006/customXml" ds:itemID="{077DB219-E873-4711-93A1-466AFC3AFFCD}">
+  <ds:schemaRefs>
+    <ds:schemaRef ds:uri="http://schemas.openxmlformats.org/officeDocument/2006/bibliography"/>
+  </ds:schemaRefs>
+</ds:datastoreItem>
+</file>
+
+<file path=customXml/itemProps2.xml><?xml version="1.0" encoding="utf-8"?>
 <ds:datastoreItem xmlns:ds="http://schemas.openxmlformats.org/officeDocument/2006/customXml" ds:itemID="{A06FEAF8-D1E3-4DAA-A32C-64B3F189012D}">
   <ds:schemaRefs>
     <ds:schemaRef ds:uri="http://schemas.microsoft.com/office/2006/metadata/contentType"/>
@@ -10453,18 +10361,11 @@
 </ds:datastoreItem>
 </file>
 
-<file path=customXml/itemProps2.xml><?xml version="1.0" encoding="utf-8"?>
-<ds:datastoreItem xmlns:ds="http://schemas.openxmlformats.org/officeDocument/2006/customXml" ds:itemID="{077DB219-E873-4711-93A1-466AFC3AFFCD}">
+<file path=customXml/itemProps3.xml><?xml version="1.0" encoding="utf-8"?>
+<ds:datastoreItem xmlns:ds="http://schemas.openxmlformats.org/officeDocument/2006/customXml" ds:itemID="{11111111-1234-1234-1234-123412341234}">
   <ds:schemaRefs>
-    <ds:schemaRef ds:uri="http://schemas.openxmlformats.org/officeDocument/2006/bibliography"/>
-  </ds:schemaRefs>
-</ds:datastoreItem>
-</file>
-
-<file path=customXml/itemProps3.xml><?xml version="1.0" encoding="utf-8"?>
-<ds:datastoreItem xmlns:ds="http://schemas.openxmlformats.org/officeDocument/2006/customXml" ds:itemID="{D2C18057-4B07-48E5-9C44-6590717A6C35}">
-  <ds:schemaRefs>
-    <ds:schemaRef ds:uri="http://schemas.microsoft.com/sharepoint/v3/contenttype/forms"/>
+    <ds:schemaRef ds:uri="http://customooxmlschemas.google.com/"/>
+    <ds:schemaRef ds:uri="http://schemas.openxmlformats.org/officeDocument/2006/relationships"/>
   </ds:schemaRefs>
 </ds:datastoreItem>
 </file>
@@ -10481,10 +10382,9 @@
 </file>
 
 <file path=customXml/itemProps5.xml><?xml version="1.0" encoding="utf-8"?>
-<ds:datastoreItem xmlns:ds="http://schemas.openxmlformats.org/officeDocument/2006/customXml" ds:itemID="{11111111-1234-1234-1234-123412341234}">
+<ds:datastoreItem xmlns:ds="http://schemas.openxmlformats.org/officeDocument/2006/customXml" ds:itemID="{D2C18057-4B07-48E5-9C44-6590717A6C35}">
   <ds:schemaRefs>
-    <ds:schemaRef ds:uri="http://customooxmlschemas.google.com/"/>
-    <ds:schemaRef ds:uri="http://schemas.openxmlformats.org/officeDocument/2006/relationships"/>
+    <ds:schemaRef ds:uri="http://schemas.microsoft.com/sharepoint/v3/contenttype/forms"/>
   </ds:schemaRefs>
 </ds:datastoreItem>
 </file>
</xml_diff>